<commit_message>
Add FreeRTOS integration with task1 demo
- Add FreeRTOS kernel source under MDK-ARM/freeRTOS
- Add App_freeRTOS_Task task entry and start scheduler from main
- Route SysTick to xPortSysTickHandler, remove SVC/PendSV handlers
- Update project files (uvprojx/uvoptx/ioc)
</commit_message>
<xml_diff>
--- a/基础解析/USART/uart.docx
+++ b/基础解析/USART/uart.docx
@@ -5,7 +5,19 @@
     <w:p>
       <w:pPr>
         <w:pStyle w:val="2"/>
+        <w:pageBreakBefore w:val="0"/>
+        <w:widowControl w:val="0"/>
+        <w:kinsoku/>
+        <w:wordWrap/>
+        <w:overflowPunct/>
+        <w:topLinePunct w:val="0"/>
+        <w:autoSpaceDE/>
+        <w:autoSpaceDN/>
         <w:bidi w:val="0"/>
+        <w:adjustRightInd/>
+        <w:snapToGrid/>
+        <w:spacing w:line="240" w:lineRule="auto"/>
+        <w:textAlignment w:val="auto"/>
         <w:rPr>
           <w:rFonts w:hint="eastAsia"/>
           <w:lang w:val="en-US" w:eastAsia="zh-CN"/>
@@ -16,929 +28,278 @@
           <w:rFonts w:hint="eastAsia"/>
           <w:lang w:val="en-US" w:eastAsia="zh-CN"/>
         </w:rPr>
-        <w:t>HAL_UART_Transmit</w:t>
+        <w:t>HAL_UART_Init()</w:t>
+      </w:r>
+    </w:p>
+    <w:p>
+      <w:pPr>
+        <w:pageBreakBefore w:val="0"/>
+        <w:widowControl w:val="0"/>
+        <w:kinsoku/>
+        <w:wordWrap/>
+        <w:overflowPunct/>
+        <w:topLinePunct w:val="0"/>
+        <w:autoSpaceDE/>
+        <w:autoSpaceDN/>
+        <w:bidi w:val="0"/>
+        <w:adjustRightInd/>
+        <w:snapToGrid/>
+        <w:spacing w:line="240" w:lineRule="auto"/>
+        <w:textAlignment w:val="auto"/>
+        <w:rPr>
+          <w:rFonts w:hint="eastAsia"/>
+          <w:lang w:val="en-US" w:eastAsia="zh-CN"/>
+        </w:rPr>
+      </w:pPr>
+      <w:r>
+        <w:rPr>
+          <w:rFonts w:hint="default" w:ascii="Symbol" w:hAnsi="Symbol" w:eastAsia="宋体" w:cs="Symbol"/>
+          <w:b w:val="0"/>
+          <w:bCs w:val="0"/>
+          <w:kern w:val="2"/>
+          <w:sz w:val="20"/>
+          <w:szCs w:val="24"/>
+          <w:lang w:val="en-US" w:eastAsia="zh-CN" w:bidi="ar-SA"/>
+        </w:rPr>
+        <w:t></w:t>
+      </w:r>
+      <w:r>
+        <w:rPr>
+          <w:rFonts w:hint="eastAsia"/>
+          <w:lang w:val="en-US" w:eastAsia="zh-CN"/>
+        </w:rPr>
+        <w:t>功能：初始化串口。</w:t>
+      </w:r>
+    </w:p>
+    <w:p>
+      <w:pPr>
+        <w:pageBreakBefore w:val="0"/>
+        <w:widowControl w:val="0"/>
+        <w:kinsoku/>
+        <w:wordWrap/>
+        <w:overflowPunct/>
+        <w:topLinePunct w:val="0"/>
+        <w:autoSpaceDE/>
+        <w:autoSpaceDN/>
+        <w:bidi w:val="0"/>
+        <w:adjustRightInd/>
+        <w:snapToGrid/>
+        <w:spacing w:line="240" w:lineRule="auto"/>
+        <w:textAlignment w:val="auto"/>
+        <w:rPr>
+          <w:rFonts w:hint="eastAsia"/>
+          <w:lang w:val="en-US" w:eastAsia="zh-CN"/>
+        </w:rPr>
+      </w:pPr>
+      <w:r>
+        <w:rPr>
+          <w:rFonts w:hint="default" w:ascii="Symbol" w:hAnsi="Symbol" w:eastAsia="宋体" w:cs="Symbol"/>
+          <w:b w:val="0"/>
+          <w:bCs w:val="0"/>
+          <w:kern w:val="2"/>
+          <w:sz w:val="20"/>
+          <w:szCs w:val="24"/>
+          <w:lang w:val="en-US" w:eastAsia="zh-CN" w:bidi="ar-SA"/>
+        </w:rPr>
+        <w:t></w:t>
+      </w:r>
+      <w:r>
+        <w:rPr>
+          <w:rFonts w:hint="eastAsia"/>
+          <w:lang w:val="en-US" w:eastAsia="zh-CN"/>
+        </w:rPr>
+        <w:t>参数：串口句柄指针。</w:t>
+      </w:r>
+    </w:p>
+    <w:p>
+      <w:pPr>
+        <w:pageBreakBefore w:val="0"/>
+        <w:widowControl w:val="0"/>
+        <w:kinsoku/>
+        <w:wordWrap/>
+        <w:overflowPunct/>
+        <w:topLinePunct w:val="0"/>
+        <w:autoSpaceDE/>
+        <w:autoSpaceDN/>
+        <w:bidi w:val="0"/>
+        <w:adjustRightInd/>
+        <w:snapToGrid/>
+        <w:spacing w:line="240" w:lineRule="auto"/>
+        <w:textAlignment w:val="auto"/>
+        <w:rPr>
+          <w:rFonts w:hint="eastAsia"/>
+          <w:lang w:val="en-US" w:eastAsia="zh-CN"/>
+        </w:rPr>
+      </w:pPr>
+      <w:r>
+        <w:rPr>
+          <w:rFonts w:hint="default" w:ascii="Symbol" w:hAnsi="Symbol" w:eastAsia="宋体" w:cs="Symbol"/>
+          <w:b w:val="0"/>
+          <w:bCs w:val="0"/>
+          <w:kern w:val="2"/>
+          <w:sz w:val="20"/>
+          <w:szCs w:val="24"/>
+          <w:lang w:val="en-US" w:eastAsia="zh-CN" w:bidi="ar-SA"/>
+        </w:rPr>
+        <w:t></w:t>
+      </w:r>
+      <w:r>
+        <w:rPr>
+          <w:rFonts w:hint="eastAsia"/>
+          <w:lang w:val="en-US" w:eastAsia="zh-CN"/>
+        </w:rPr>
+        <w:t>返回值：HAL状态。</w:t>
+      </w:r>
+    </w:p>
+    <w:sdt>
+      <w:sdtPr>
+        <w:rPr>
+          <w:rFonts w:hint="eastAsia" w:ascii="Consolas" w:eastAsia="宋体" w:hAnsiTheme="minorAscii" w:cstheme="minorBidi"/>
+          <w:kern w:val="2"/>
+          <w:sz w:val="21"/>
+          <w:szCs w:val="24"/>
+          <w:shd w:val="clear"/>
+          <w:lang w:val="en-US" w:eastAsia="zh-CN" w:bidi="ar-SA"/>
+        </w:rPr>
+        <w:id w:val="147460517"/>
+        <w:placeholder>
+          <w:docPart w:val="{63e925f5-1632-4c96-8732-1f5967f56faf}"/>
+        </w:placeholder>
+        <w15:appearance w15:val="hidden"/>
+      </w:sdtPr>
+      <w:sdtEndPr>
+        <w:rPr>
+          <w:rFonts w:hint="eastAsia" w:ascii="Consolas" w:eastAsia="宋体" w:hAnsiTheme="minorAscii" w:cstheme="minorBidi"/>
+          <w:kern w:val="2"/>
+          <w:sz w:val="21"/>
+          <w:szCs w:val="24"/>
+          <w:shd w:val="clear"/>
+          <w:lang w:val="en-US" w:eastAsia="zh-CN" w:bidi="ar-SA"/>
+        </w:rPr>
+      </w:sdtEndPr>
+      <w:sdtContent>
+        <w:p>
+          <w:pPr>
+            <w:shd w:val="clear" w:fill="F5F5F5"/>
+            <w:bidi w:val="0"/>
+            <w:ind w:left="480" w:leftChars="200"/>
+            <w:rPr>
+              <w:rFonts w:hint="eastAsia" w:ascii="Consolas"/>
+              <w:sz w:val="21"/>
+              <w:shd w:val="clear"/>
+              <w:lang w:val="en-US" w:eastAsia="zh-CN"/>
+            </w:rPr>
+          </w:pPr>
+          <w:r>
+            <w:rPr>
+              <w:rFonts w:hint="eastAsia" w:ascii="Consolas" w:eastAsia="宋体" w:hAnsiTheme="minorAscii" w:cstheme="minorBidi"/>
+              <w:color w:val="252525"/>
+              <w:kern w:val="2"/>
+              <w:sz w:val="21"/>
+              <w:szCs w:val="24"/>
+              <w:shd w:val="clear"/>
+              <w:lang w:val="en-US" w:eastAsia="zh-CN" w:bidi="ar-SA"/>
+            </w:rPr>
+            <w:t xml:space="preserve"> </w:t>
+          </w:r>
+          <w:r>
+            <w:rPr>
+              <w:rFonts w:hint="eastAsia" w:ascii="Consolas" w:eastAsia="宋体" w:hAnsiTheme="minorAscii" w:cstheme="minorBidi"/>
+              <w:color w:val="BB2726"/>
+              <w:kern w:val="2"/>
+              <w:sz w:val="21"/>
+              <w:szCs w:val="24"/>
+              <w:shd w:val="clear"/>
+              <w:lang w:val="en-US" w:eastAsia="zh-CN" w:bidi="ar-SA"/>
+            </w:rPr>
+            <w:t>HAL_UART_Init</w:t>
+          </w:r>
+          <w:r>
+            <w:rPr>
+              <w:rFonts w:hint="eastAsia" w:ascii="Consolas" w:eastAsia="宋体" w:hAnsiTheme="minorAscii" w:cstheme="minorBidi"/>
+              <w:color w:val="252525"/>
+              <w:kern w:val="2"/>
+              <w:sz w:val="21"/>
+              <w:szCs w:val="24"/>
+              <w:shd w:val="clear"/>
+              <w:lang w:val="en-US" w:eastAsia="zh-CN" w:bidi="ar-SA"/>
+            </w:rPr>
+            <w:t>(&amp;</w:t>
+          </w:r>
+          <w:r>
+            <w:rPr>
+              <w:rFonts w:hint="eastAsia" w:ascii="Consolas" w:eastAsia="宋体" w:hAnsiTheme="minorAscii" w:cstheme="minorBidi"/>
+              <w:color w:val="BB2726"/>
+              <w:kern w:val="2"/>
+              <w:sz w:val="21"/>
+              <w:szCs w:val="24"/>
+              <w:shd w:val="clear"/>
+              <w:lang w:val="en-US" w:eastAsia="zh-CN" w:bidi="ar-SA"/>
+            </w:rPr>
+            <w:t>huart2</w:t>
+          </w:r>
+          <w:r>
+            <w:rPr>
+              <w:rFonts w:hint="eastAsia" w:ascii="Consolas" w:eastAsia="宋体" w:hAnsiTheme="minorAscii" w:cstheme="minorBidi"/>
+              <w:color w:val="252525"/>
+              <w:kern w:val="2"/>
+              <w:sz w:val="21"/>
+              <w:szCs w:val="24"/>
+              <w:shd w:val="clear"/>
+              <w:lang w:val="en-US" w:eastAsia="zh-CN" w:bidi="ar-SA"/>
+            </w:rPr>
+            <w:t>);</w:t>
+          </w:r>
+        </w:p>
+      </w:sdtContent>
+    </w:sdt>
+    <w:p>
+      <w:pPr>
+        <w:pStyle w:val="2"/>
+        <w:bidi w:val="0"/>
+        <w:rPr>
+          <w:rFonts w:hint="eastAsia"/>
+          <w:lang w:val="en-US" w:eastAsia="zh-CN"/>
+        </w:rPr>
+      </w:pPr>
+      <w:r>
+        <w:rPr>
+          <w:rFonts w:hint="eastAsia"/>
+          <w:lang w:val="en-US" w:eastAsia="zh-CN"/>
+        </w:rPr>
+        <w:t>HAL_UART_Transmit()</w:t>
       </w:r>
     </w:p>
     <w:p>
       <w:pPr>
         <w:bidi w:val="0"/>
+        <w:rPr>
+          <w:rFonts w:hint="eastAsia"/>
+          <w:lang w:val="en-US" w:eastAsia="zh-CN"/>
+        </w:rPr>
       </w:pPr>
       <w:r>
-        <w:t>HAL 库串口阻塞式发送函数：把指定缓冲区的数据通过串口发送出去，会一直等待发送完成才返回，发送期间程序卡在该函数，不能执行后面代码。</w:t>
+        <w:rPr>
+          <w:rFonts w:hint="default" w:ascii="Symbol" w:hAnsi="Symbol" w:eastAsia="宋体" w:cs="Symbol"/>
+          <w:b w:val="0"/>
+          <w:bCs w:val="0"/>
+          <w:kern w:val="2"/>
+          <w:sz w:val="20"/>
+          <w:szCs w:val="24"/>
+          <w:lang w:val="en-US" w:eastAsia="zh-CN" w:bidi="ar-SA"/>
+        </w:rPr>
+        <w:t></w:t>
+      </w:r>
+      <w:r>
+        <w:rPr>
+          <w:rFonts w:hint="eastAsia"/>
+          <w:lang w:val="en-US" w:eastAsia="zh-CN"/>
+        </w:rPr>
+        <w:t>功能：以阻塞模式发送数据。</w:t>
       </w:r>
     </w:p>
-    <w:sdt>
-      <w:sdtPr>
-        <w:rPr>
-          <w:rFonts w:ascii="Consolas" w:eastAsia="宋体" w:hAnsiTheme="minorAscii" w:cstheme="minorBidi"/>
-          <w:kern w:val="2"/>
-          <w:sz w:val="21"/>
-          <w:szCs w:val="24"/>
-          <w:shd w:val="clear"/>
-          <w:lang w:val="en-US" w:eastAsia="zh-CN" w:bidi="ar-SA"/>
-        </w:rPr>
-        <w:id w:val="147464650"/>
-        <w:placeholder>
-          <w:docPart w:val="{afdc4649-1f91-497d-820f-c049562cbc20}"/>
-        </w:placeholder>
-        <w15:appearance w15:val="hidden"/>
-      </w:sdtPr>
-      <w:sdtEndPr>
-        <w:rPr>
-          <w:rFonts w:ascii="Consolas" w:eastAsia="宋体" w:hAnsiTheme="minorAscii" w:cstheme="minorBidi"/>
-          <w:kern w:val="2"/>
-          <w:sz w:val="21"/>
-          <w:szCs w:val="24"/>
-          <w:shd w:val="clear"/>
-          <w:lang w:val="en-US" w:eastAsia="zh-CN" w:bidi="ar-SA"/>
-        </w:rPr>
-      </w:sdtEndPr>
-      <w:sdtContent>
-        <w:p>
-          <w:pPr>
-            <w:shd w:val="clear" w:fill="F5F5F5"/>
-            <w:bidi w:val="0"/>
-            <w:ind w:left="480" w:leftChars="200"/>
-            <w:rPr>
-              <w:rFonts w:hint="eastAsia" w:ascii="Consolas" w:eastAsia="宋体" w:hAnsiTheme="minorAscii" w:cstheme="minorBidi"/>
-              <w:color w:val="252525"/>
-              <w:kern w:val="2"/>
-              <w:sz w:val="21"/>
-              <w:szCs w:val="24"/>
-              <w:shd w:val="clear"/>
-              <w:lang w:val="en-US" w:eastAsia="zh-CN" w:bidi="ar-SA"/>
-            </w:rPr>
-          </w:pPr>
-          <w:r>
-            <w:rPr>
-              <w:rFonts w:hint="eastAsia" w:ascii="Consolas" w:eastAsia="宋体" w:hAnsiTheme="minorAscii" w:cstheme="minorBidi"/>
-              <w:color w:val="347317"/>
-              <w:kern w:val="2"/>
-              <w:sz w:val="21"/>
-              <w:szCs w:val="24"/>
-              <w:shd w:val="clear"/>
-              <w:lang w:val="en-US" w:eastAsia="zh-CN" w:bidi="ar-SA"/>
-            </w:rPr>
-            <w:t>HAL_StatusTypeDef</w:t>
-          </w:r>
-          <w:r>
-            <w:rPr>
-              <w:rFonts w:hint="eastAsia" w:ascii="Consolas" w:eastAsia="宋体" w:hAnsiTheme="minorAscii" w:cstheme="minorBidi"/>
-              <w:color w:val="252525"/>
-              <w:kern w:val="2"/>
-              <w:sz w:val="21"/>
-              <w:szCs w:val="24"/>
-              <w:shd w:val="clear"/>
-              <w:lang w:val="en-US" w:eastAsia="zh-CN" w:bidi="ar-SA"/>
-            </w:rPr>
-            <w:t xml:space="preserve"> </w:t>
-          </w:r>
-          <w:r>
-            <w:rPr>
-              <w:rFonts w:hint="eastAsia" w:ascii="Consolas" w:eastAsia="宋体" w:hAnsiTheme="minorAscii" w:cstheme="minorBidi"/>
-              <w:color w:val="BB2726"/>
-              <w:kern w:val="2"/>
-              <w:sz w:val="21"/>
-              <w:szCs w:val="24"/>
-              <w:shd w:val="clear"/>
-              <w:lang w:val="en-US" w:eastAsia="zh-CN" w:bidi="ar-SA"/>
-            </w:rPr>
-            <w:t>HAL_UART_Transmit</w:t>
-          </w:r>
-          <w:r>
-            <w:rPr>
-              <w:rFonts w:hint="eastAsia" w:ascii="Consolas" w:eastAsia="宋体" w:hAnsiTheme="minorAscii" w:cstheme="minorBidi"/>
-              <w:color w:val="252525"/>
-              <w:kern w:val="2"/>
-              <w:sz w:val="21"/>
-              <w:szCs w:val="24"/>
-              <w:shd w:val="clear"/>
-              <w:lang w:val="en-US" w:eastAsia="zh-CN" w:bidi="ar-SA"/>
-            </w:rPr>
-            <w:t>(</w:t>
-          </w:r>
-        </w:p>
-        <w:p>
-          <w:pPr>
-            <w:shd w:val="clear" w:fill="F5F5F5"/>
-            <w:bidi w:val="0"/>
-            <w:ind w:left="480" w:leftChars="200"/>
-            <w:rPr>
-              <w:rFonts w:hint="eastAsia" w:ascii="Consolas" w:eastAsia="宋体" w:hAnsiTheme="minorAscii" w:cstheme="minorBidi"/>
-              <w:color w:val="252525"/>
-              <w:kern w:val="2"/>
-              <w:sz w:val="21"/>
-              <w:szCs w:val="24"/>
-              <w:shd w:val="clear"/>
-              <w:lang w:val="en-US" w:eastAsia="zh-CN" w:bidi="ar-SA"/>
-            </w:rPr>
-          </w:pPr>
-          <w:r>
-            <w:rPr>
-              <w:rFonts w:hint="eastAsia" w:ascii="Consolas" w:eastAsia="宋体" w:hAnsiTheme="minorAscii" w:cstheme="minorBidi"/>
-              <w:color w:val="252525"/>
-              <w:kern w:val="2"/>
-              <w:sz w:val="21"/>
-              <w:szCs w:val="24"/>
-              <w:shd w:val="clear"/>
-              <w:lang w:val="en-US" w:eastAsia="zh-CN" w:bidi="ar-SA"/>
-            </w:rPr>
-            <w:t xml:space="preserve">    </w:t>
-          </w:r>
-          <w:r>
-            <w:rPr>
-              <w:rFonts w:hint="eastAsia" w:ascii="Consolas" w:eastAsia="宋体" w:hAnsiTheme="minorAscii" w:cstheme="minorBidi"/>
-              <w:color w:val="347317"/>
-              <w:kern w:val="2"/>
-              <w:sz w:val="21"/>
-              <w:szCs w:val="24"/>
-              <w:shd w:val="clear"/>
-              <w:lang w:val="en-US" w:eastAsia="zh-CN" w:bidi="ar-SA"/>
-            </w:rPr>
-            <w:t>UART_HandleTypeDef</w:t>
-          </w:r>
-          <w:r>
-            <w:rPr>
-              <w:rFonts w:hint="eastAsia" w:ascii="Consolas" w:eastAsia="宋体" w:hAnsiTheme="minorAscii" w:cstheme="minorBidi"/>
-              <w:color w:val="252525"/>
-              <w:kern w:val="2"/>
-              <w:sz w:val="21"/>
-              <w:szCs w:val="24"/>
-              <w:shd w:val="clear"/>
-              <w:lang w:val="en-US" w:eastAsia="zh-CN" w:bidi="ar-SA"/>
-            </w:rPr>
-            <w:t xml:space="preserve"> </w:t>
-          </w:r>
-          <w:r>
-            <w:rPr>
-              <w:rFonts w:hint="eastAsia" w:ascii="Consolas" w:eastAsia="宋体" w:hAnsiTheme="minorAscii" w:cstheme="minorBidi"/>
-              <w:color w:val="BB2726"/>
-              <w:kern w:val="2"/>
-              <w:sz w:val="21"/>
-              <w:szCs w:val="24"/>
-              <w:shd w:val="clear"/>
-              <w:lang w:val="en-US" w:eastAsia="zh-CN" w:bidi="ar-SA"/>
-            </w:rPr>
-            <w:t>*huart</w:t>
-          </w:r>
-          <w:r>
-            <w:rPr>
-              <w:rFonts w:hint="eastAsia" w:ascii="Consolas" w:eastAsia="宋体" w:hAnsiTheme="minorAscii" w:cstheme="minorBidi"/>
-              <w:color w:val="252525"/>
-              <w:kern w:val="2"/>
-              <w:sz w:val="21"/>
-              <w:szCs w:val="24"/>
-              <w:shd w:val="clear"/>
-              <w:lang w:val="en-US" w:eastAsia="zh-CN" w:bidi="ar-SA"/>
-            </w:rPr>
-            <w:t xml:space="preserve">,  </w:t>
-          </w:r>
-          <w:r>
-            <w:rPr>
-              <w:rFonts w:hint="eastAsia" w:ascii="Consolas" w:eastAsia="宋体" w:hAnsiTheme="minorAscii" w:cstheme="minorBidi"/>
-              <w:color w:val="909090"/>
-              <w:kern w:val="2"/>
-              <w:sz w:val="21"/>
-              <w:szCs w:val="24"/>
-              <w:shd w:val="clear"/>
-              <w:lang w:val="en-US" w:eastAsia="zh-CN" w:bidi="ar-SA"/>
-            </w:rPr>
-            <w:t>// UART句柄指针</w:t>
-          </w:r>
-        </w:p>
-        <w:p>
-          <w:pPr>
-            <w:shd w:val="clear" w:fill="F5F5F5"/>
-            <w:bidi w:val="0"/>
-            <w:ind w:left="480" w:leftChars="200"/>
-            <w:rPr>
-              <w:rFonts w:hint="eastAsia" w:ascii="Consolas" w:eastAsia="宋体" w:hAnsiTheme="minorAscii" w:cstheme="minorBidi"/>
-              <w:color w:val="252525"/>
-              <w:kern w:val="2"/>
-              <w:sz w:val="21"/>
-              <w:szCs w:val="24"/>
-              <w:shd w:val="clear"/>
-              <w:lang w:val="en-US" w:eastAsia="zh-CN" w:bidi="ar-SA"/>
-            </w:rPr>
-          </w:pPr>
-          <w:r>
-            <w:rPr>
-              <w:rFonts w:hint="eastAsia" w:ascii="Consolas" w:eastAsia="宋体" w:hAnsiTheme="minorAscii" w:cstheme="minorBidi"/>
-              <w:color w:val="252525"/>
-              <w:kern w:val="2"/>
-              <w:sz w:val="21"/>
-              <w:szCs w:val="24"/>
-              <w:shd w:val="clear"/>
-              <w:lang w:val="en-US" w:eastAsia="zh-CN" w:bidi="ar-SA"/>
-            </w:rPr>
-            <w:t xml:space="preserve">    </w:t>
-          </w:r>
-          <w:r>
-            <w:rPr>
-              <w:rFonts w:hint="eastAsia" w:ascii="Consolas" w:eastAsia="宋体" w:hAnsiTheme="minorAscii" w:cstheme="minorBidi"/>
-              <w:color w:val="1E5FC7"/>
-              <w:kern w:val="2"/>
-              <w:sz w:val="21"/>
-              <w:szCs w:val="24"/>
-              <w:shd w:val="clear"/>
-              <w:lang w:val="en-US" w:eastAsia="zh-CN" w:bidi="ar-SA"/>
-            </w:rPr>
-            <w:t>uint8_t</w:t>
-          </w:r>
-          <w:r>
-            <w:rPr>
-              <w:rFonts w:hint="eastAsia" w:ascii="Consolas" w:eastAsia="宋体" w:hAnsiTheme="minorAscii" w:cstheme="minorBidi"/>
-              <w:color w:val="252525"/>
-              <w:kern w:val="2"/>
-              <w:sz w:val="21"/>
-              <w:szCs w:val="24"/>
-              <w:shd w:val="clear"/>
-              <w:lang w:val="en-US" w:eastAsia="zh-CN" w:bidi="ar-SA"/>
-            </w:rPr>
-            <w:t xml:space="preserve"> </w:t>
-          </w:r>
-          <w:r>
-            <w:rPr>
-              <w:rFonts w:hint="eastAsia" w:ascii="Consolas" w:eastAsia="宋体" w:hAnsiTheme="minorAscii" w:cstheme="minorBidi"/>
-              <w:color w:val="BB2726"/>
-              <w:kern w:val="2"/>
-              <w:sz w:val="21"/>
-              <w:szCs w:val="24"/>
-              <w:shd w:val="clear"/>
-              <w:lang w:val="en-US" w:eastAsia="zh-CN" w:bidi="ar-SA"/>
-            </w:rPr>
-            <w:t>*pData</w:t>
-          </w:r>
-          <w:r>
-            <w:rPr>
-              <w:rFonts w:hint="eastAsia" w:ascii="Consolas" w:eastAsia="宋体" w:hAnsiTheme="minorAscii" w:cstheme="minorBidi"/>
-              <w:color w:val="252525"/>
-              <w:kern w:val="2"/>
-              <w:sz w:val="21"/>
-              <w:szCs w:val="24"/>
-              <w:shd w:val="clear"/>
-              <w:lang w:val="en-US" w:eastAsia="zh-CN" w:bidi="ar-SA"/>
-            </w:rPr>
-            <w:t xml:space="preserve">,             </w:t>
-          </w:r>
-          <w:r>
-            <w:rPr>
-              <w:rFonts w:hint="eastAsia" w:ascii="Consolas" w:eastAsia="宋体" w:hAnsiTheme="minorAscii" w:cstheme="minorBidi"/>
-              <w:color w:val="909090"/>
-              <w:kern w:val="2"/>
-              <w:sz w:val="21"/>
-              <w:szCs w:val="24"/>
-              <w:shd w:val="clear"/>
-              <w:lang w:val="en-US" w:eastAsia="zh-CN" w:bidi="ar-SA"/>
-            </w:rPr>
-            <w:t>// 要发送的数据缓冲区</w:t>
-          </w:r>
-        </w:p>
-        <w:p>
-          <w:pPr>
-            <w:shd w:val="clear" w:fill="F5F5F5"/>
-            <w:bidi w:val="0"/>
-            <w:ind w:left="480" w:leftChars="200"/>
-            <w:rPr>
-              <w:rFonts w:hint="eastAsia" w:ascii="Consolas" w:eastAsia="宋体" w:hAnsiTheme="minorAscii" w:cstheme="minorBidi"/>
-              <w:color w:val="252525"/>
-              <w:kern w:val="2"/>
-              <w:sz w:val="21"/>
-              <w:szCs w:val="24"/>
-              <w:shd w:val="clear"/>
-              <w:lang w:val="en-US" w:eastAsia="zh-CN" w:bidi="ar-SA"/>
-            </w:rPr>
-          </w:pPr>
-          <w:r>
-            <w:rPr>
-              <w:rFonts w:hint="eastAsia" w:ascii="Consolas" w:eastAsia="宋体" w:hAnsiTheme="minorAscii" w:cstheme="minorBidi"/>
-              <w:color w:val="252525"/>
-              <w:kern w:val="2"/>
-              <w:sz w:val="21"/>
-              <w:szCs w:val="24"/>
-              <w:shd w:val="clear"/>
-              <w:lang w:val="en-US" w:eastAsia="zh-CN" w:bidi="ar-SA"/>
-            </w:rPr>
-            <w:t xml:space="preserve">    </w:t>
-          </w:r>
-          <w:r>
-            <w:rPr>
-              <w:rFonts w:hint="eastAsia" w:ascii="Consolas" w:eastAsia="宋体" w:hAnsiTheme="minorAscii" w:cstheme="minorBidi"/>
-              <w:color w:val="1E5FC7"/>
-              <w:kern w:val="2"/>
-              <w:sz w:val="21"/>
-              <w:szCs w:val="24"/>
-              <w:shd w:val="clear"/>
-              <w:lang w:val="en-US" w:eastAsia="zh-CN" w:bidi="ar-SA"/>
-            </w:rPr>
-            <w:t>uint16_t</w:t>
-          </w:r>
-          <w:r>
-            <w:rPr>
-              <w:rFonts w:hint="eastAsia" w:ascii="Consolas" w:eastAsia="宋体" w:hAnsiTheme="minorAscii" w:cstheme="minorBidi"/>
-              <w:color w:val="252525"/>
-              <w:kern w:val="2"/>
-              <w:sz w:val="21"/>
-              <w:szCs w:val="24"/>
-              <w:shd w:val="clear"/>
-              <w:lang w:val="en-US" w:eastAsia="zh-CN" w:bidi="ar-SA"/>
-            </w:rPr>
-            <w:t xml:space="preserve"> </w:t>
-          </w:r>
-          <w:r>
-            <w:rPr>
-              <w:rFonts w:hint="eastAsia" w:ascii="Consolas" w:eastAsia="宋体" w:hAnsiTheme="minorAscii" w:cstheme="minorBidi"/>
-              <w:color w:val="BB2726"/>
-              <w:kern w:val="2"/>
-              <w:sz w:val="21"/>
-              <w:szCs w:val="24"/>
-              <w:shd w:val="clear"/>
-              <w:lang w:val="en-US" w:eastAsia="zh-CN" w:bidi="ar-SA"/>
-            </w:rPr>
-            <w:t>Size</w:t>
-          </w:r>
-          <w:r>
-            <w:rPr>
-              <w:rFonts w:hint="eastAsia" w:ascii="Consolas" w:eastAsia="宋体" w:hAnsiTheme="minorAscii" w:cstheme="minorBidi"/>
-              <w:color w:val="252525"/>
-              <w:kern w:val="2"/>
-              <w:sz w:val="21"/>
-              <w:szCs w:val="24"/>
-              <w:shd w:val="clear"/>
-              <w:lang w:val="en-US" w:eastAsia="zh-CN" w:bidi="ar-SA"/>
-            </w:rPr>
-            <w:t xml:space="preserve">,              </w:t>
-          </w:r>
-          <w:r>
-            <w:rPr>
-              <w:rFonts w:hint="eastAsia" w:ascii="Consolas" w:eastAsia="宋体" w:hAnsiTheme="minorAscii" w:cstheme="minorBidi"/>
-              <w:color w:val="909090"/>
-              <w:kern w:val="2"/>
-              <w:sz w:val="21"/>
-              <w:szCs w:val="24"/>
-              <w:shd w:val="clear"/>
-              <w:lang w:val="en-US" w:eastAsia="zh-CN" w:bidi="ar-SA"/>
-            </w:rPr>
-            <w:t>// 发送字节个数</w:t>
-          </w:r>
-        </w:p>
-        <w:p>
-          <w:pPr>
-            <w:shd w:val="clear" w:fill="F5F5F5"/>
-            <w:bidi w:val="0"/>
-            <w:ind w:left="480" w:leftChars="200"/>
-            <w:rPr>
-              <w:rFonts w:hint="eastAsia" w:ascii="Consolas" w:eastAsia="宋体" w:hAnsiTheme="minorAscii" w:cstheme="minorBidi"/>
-              <w:color w:val="252525"/>
-              <w:kern w:val="2"/>
-              <w:sz w:val="21"/>
-              <w:szCs w:val="24"/>
-              <w:shd w:val="clear"/>
-              <w:lang w:val="en-US" w:eastAsia="zh-CN" w:bidi="ar-SA"/>
-            </w:rPr>
-          </w:pPr>
-          <w:r>
-            <w:rPr>
-              <w:rFonts w:hint="eastAsia" w:ascii="Consolas" w:eastAsia="宋体" w:hAnsiTheme="minorAscii" w:cstheme="minorBidi"/>
-              <w:color w:val="252525"/>
-              <w:kern w:val="2"/>
-              <w:sz w:val="21"/>
-              <w:szCs w:val="24"/>
-              <w:shd w:val="clear"/>
-              <w:lang w:val="en-US" w:eastAsia="zh-CN" w:bidi="ar-SA"/>
-            </w:rPr>
-            <w:t xml:space="preserve">    </w:t>
-          </w:r>
-          <w:r>
-            <w:rPr>
-              <w:rFonts w:hint="eastAsia" w:ascii="Consolas" w:eastAsia="宋体" w:hAnsiTheme="minorAscii" w:cstheme="minorBidi"/>
-              <w:color w:val="1E5FC7"/>
-              <w:kern w:val="2"/>
-              <w:sz w:val="21"/>
-              <w:szCs w:val="24"/>
-              <w:shd w:val="clear"/>
-              <w:lang w:val="en-US" w:eastAsia="zh-CN" w:bidi="ar-SA"/>
-            </w:rPr>
-            <w:t>uint32_t</w:t>
-          </w:r>
-          <w:r>
-            <w:rPr>
-              <w:rFonts w:hint="eastAsia" w:ascii="Consolas" w:eastAsia="宋体" w:hAnsiTheme="minorAscii" w:cstheme="minorBidi"/>
-              <w:color w:val="252525"/>
-              <w:kern w:val="2"/>
-              <w:sz w:val="21"/>
-              <w:szCs w:val="24"/>
-              <w:shd w:val="clear"/>
-              <w:lang w:val="en-US" w:eastAsia="zh-CN" w:bidi="ar-SA"/>
-            </w:rPr>
-            <w:t xml:space="preserve"> </w:t>
-          </w:r>
-          <w:r>
-            <w:rPr>
-              <w:rFonts w:hint="eastAsia" w:ascii="Consolas" w:eastAsia="宋体" w:hAnsiTheme="minorAscii" w:cstheme="minorBidi"/>
-              <w:color w:val="BB2726"/>
-              <w:kern w:val="2"/>
-              <w:sz w:val="21"/>
-              <w:szCs w:val="24"/>
-              <w:shd w:val="clear"/>
-              <w:lang w:val="en-US" w:eastAsia="zh-CN" w:bidi="ar-SA"/>
-            </w:rPr>
-            <w:t>Timeout</w:t>
-          </w:r>
-          <w:r>
-            <w:rPr>
-              <w:rFonts w:hint="eastAsia" w:ascii="Consolas" w:eastAsia="宋体" w:hAnsiTheme="minorAscii" w:cstheme="minorBidi"/>
-              <w:color w:val="252525"/>
-              <w:kern w:val="2"/>
-              <w:sz w:val="21"/>
-              <w:szCs w:val="24"/>
-              <w:shd w:val="clear"/>
-              <w:lang w:val="en-US" w:eastAsia="zh-CN" w:bidi="ar-SA"/>
-            </w:rPr>
-            <w:t xml:space="preserve">            </w:t>
-          </w:r>
-          <w:r>
-            <w:rPr>
-              <w:rFonts w:hint="eastAsia" w:ascii="Consolas" w:eastAsia="宋体" w:hAnsiTheme="minorAscii" w:cstheme="minorBidi"/>
-              <w:color w:val="909090"/>
-              <w:kern w:val="2"/>
-              <w:sz w:val="21"/>
-              <w:szCs w:val="24"/>
-              <w:shd w:val="clear"/>
-              <w:lang w:val="en-US" w:eastAsia="zh-CN" w:bidi="ar-SA"/>
-            </w:rPr>
-            <w:t>// 超时时间，单位ms</w:t>
-          </w:r>
-        </w:p>
-        <w:p>
-          <w:pPr>
-            <w:shd w:val="clear" w:fill="F5F5F5"/>
-            <w:bidi w:val="0"/>
-            <w:ind w:left="480" w:leftChars="200"/>
-            <w:rPr>
-              <w:rFonts w:hint="eastAsia" w:ascii="Consolas" w:eastAsia="宋体" w:hAnsiTheme="minorAscii" w:cstheme="minorBidi"/>
-              <w:color w:val="252525"/>
-              <w:kern w:val="2"/>
-              <w:sz w:val="21"/>
-              <w:szCs w:val="24"/>
-              <w:shd w:val="clear"/>
-              <w:lang w:val="en-US" w:eastAsia="zh-CN" w:bidi="ar-SA"/>
-            </w:rPr>
-          </w:pPr>
-          <w:r>
-            <w:rPr>
-              <w:rFonts w:hint="eastAsia" w:ascii="Consolas" w:eastAsia="宋体" w:hAnsiTheme="minorAscii" w:cstheme="minorBidi"/>
-              <w:color w:val="252525"/>
-              <w:kern w:val="2"/>
-              <w:sz w:val="21"/>
-              <w:szCs w:val="24"/>
-              <w:shd w:val="clear"/>
-              <w:lang w:val="en-US" w:eastAsia="zh-CN" w:bidi="ar-SA"/>
-            </w:rPr>
-            <w:t>);</w:t>
-          </w:r>
-        </w:p>
-        <w:p>
-          <w:pPr>
-            <w:shd w:val="clear" w:fill="F5F5F5"/>
-            <w:bidi w:val="0"/>
-            <w:ind w:left="480" w:leftChars="200"/>
-            <w:rPr>
-              <w:rFonts w:hint="eastAsia" w:ascii="Consolas" w:eastAsia="宋体" w:hAnsiTheme="minorAscii" w:cstheme="minorBidi"/>
-              <w:color w:val="252525"/>
-              <w:kern w:val="2"/>
-              <w:sz w:val="21"/>
-              <w:szCs w:val="24"/>
-              <w:shd w:val="clear"/>
-              <w:lang w:val="en-US" w:eastAsia="zh-CN" w:bidi="ar-SA"/>
-            </w:rPr>
-          </w:pPr>
-        </w:p>
-        <w:p>
-          <w:pPr>
-            <w:shd w:val="clear" w:fill="F5F5F5"/>
-            <w:bidi w:val="0"/>
-            <w:ind w:left="480" w:leftChars="200"/>
-            <w:rPr>
-              <w:rFonts w:hint="eastAsia" w:ascii="Consolas" w:eastAsia="宋体" w:hAnsiTheme="minorAscii" w:cstheme="minorBidi"/>
-              <w:color w:val="252525"/>
-              <w:kern w:val="2"/>
-              <w:sz w:val="21"/>
-              <w:szCs w:val="24"/>
-              <w:shd w:val="clear"/>
-              <w:lang w:val="en-US" w:eastAsia="zh-CN" w:bidi="ar-SA"/>
-            </w:rPr>
-          </w:pPr>
-          <w:r>
-            <w:rPr>
-              <w:rFonts w:hint="eastAsia" w:ascii="Consolas" w:eastAsia="宋体" w:hAnsiTheme="minorAscii" w:cstheme="minorBidi"/>
-              <w:color w:val="682AEF"/>
-              <w:kern w:val="2"/>
-              <w:sz w:val="21"/>
-              <w:szCs w:val="24"/>
-              <w:shd w:val="clear"/>
-              <w:lang w:val="en-US" w:eastAsia="zh-CN" w:bidi="ar-SA"/>
-            </w:rPr>
-            <w:t>typedef</w:t>
-          </w:r>
-          <w:r>
-            <w:rPr>
-              <w:rFonts w:hint="eastAsia" w:ascii="Consolas" w:eastAsia="宋体" w:hAnsiTheme="minorAscii" w:cstheme="minorBidi"/>
-              <w:color w:val="252525"/>
-              <w:kern w:val="2"/>
-              <w:sz w:val="21"/>
-              <w:szCs w:val="24"/>
-              <w:shd w:val="clear"/>
-              <w:lang w:val="en-US" w:eastAsia="zh-CN" w:bidi="ar-SA"/>
-            </w:rPr>
-            <w:t xml:space="preserve"> </w:t>
-          </w:r>
-          <w:r>
-            <w:rPr>
-              <w:rFonts w:hint="eastAsia" w:ascii="Consolas" w:eastAsia="宋体" w:hAnsiTheme="minorAscii" w:cstheme="minorBidi"/>
-              <w:color w:val="682AEF"/>
-              <w:kern w:val="2"/>
-              <w:sz w:val="21"/>
-              <w:szCs w:val="24"/>
-              <w:shd w:val="clear"/>
-              <w:lang w:val="en-US" w:eastAsia="zh-CN" w:bidi="ar-SA"/>
-            </w:rPr>
-            <w:t>enum</w:t>
-          </w:r>
-        </w:p>
-        <w:p>
-          <w:pPr>
-            <w:shd w:val="clear" w:fill="F5F5F5"/>
-            <w:bidi w:val="0"/>
-            <w:ind w:left="480" w:leftChars="200"/>
-            <w:rPr>
-              <w:rFonts w:hint="eastAsia" w:ascii="Consolas" w:eastAsia="宋体" w:hAnsiTheme="minorAscii" w:cstheme="minorBidi"/>
-              <w:color w:val="252525"/>
-              <w:kern w:val="2"/>
-              <w:sz w:val="21"/>
-              <w:szCs w:val="24"/>
-              <w:shd w:val="clear"/>
-              <w:lang w:val="en-US" w:eastAsia="zh-CN" w:bidi="ar-SA"/>
-            </w:rPr>
-          </w:pPr>
-          <w:r>
-            <w:rPr>
-              <w:rFonts w:hint="eastAsia" w:ascii="Consolas" w:eastAsia="宋体" w:hAnsiTheme="minorAscii" w:cstheme="minorBidi"/>
-              <w:color w:val="252525"/>
-              <w:kern w:val="2"/>
-              <w:sz w:val="21"/>
-              <w:szCs w:val="24"/>
-              <w:shd w:val="clear"/>
-              <w:lang w:val="en-US" w:eastAsia="zh-CN" w:bidi="ar-SA"/>
-            </w:rPr>
-            <w:t>{</w:t>
-          </w:r>
-        </w:p>
-        <w:p>
-          <w:pPr>
-            <w:shd w:val="clear" w:fill="F5F5F5"/>
-            <w:bidi w:val="0"/>
-            <w:ind w:left="480" w:leftChars="200"/>
-            <w:rPr>
-              <w:rFonts w:hint="eastAsia" w:ascii="Consolas" w:eastAsia="宋体" w:hAnsiTheme="minorAscii" w:cstheme="minorBidi"/>
-              <w:color w:val="252525"/>
-              <w:kern w:val="2"/>
-              <w:sz w:val="21"/>
-              <w:szCs w:val="24"/>
-              <w:shd w:val="clear"/>
-              <w:lang w:val="en-US" w:eastAsia="zh-CN" w:bidi="ar-SA"/>
-            </w:rPr>
-          </w:pPr>
-          <w:r>
-            <w:rPr>
-              <w:rFonts w:hint="eastAsia" w:ascii="Consolas" w:eastAsia="宋体" w:hAnsiTheme="minorAscii" w:cstheme="minorBidi"/>
-              <w:color w:val="252525"/>
-              <w:kern w:val="2"/>
-              <w:sz w:val="21"/>
-              <w:szCs w:val="24"/>
-              <w:shd w:val="clear"/>
-              <w:lang w:val="en-US" w:eastAsia="zh-CN" w:bidi="ar-SA"/>
-            </w:rPr>
-            <w:t xml:space="preserve">  </w:t>
-          </w:r>
-          <w:r>
-            <w:rPr>
-              <w:rFonts w:hint="eastAsia" w:ascii="Consolas" w:eastAsia="宋体" w:hAnsiTheme="minorAscii" w:cstheme="minorBidi"/>
-              <w:color w:val="BB2726"/>
-              <w:kern w:val="2"/>
-              <w:sz w:val="21"/>
-              <w:szCs w:val="24"/>
-              <w:shd w:val="clear"/>
-              <w:lang w:val="en-US" w:eastAsia="zh-CN" w:bidi="ar-SA"/>
-            </w:rPr>
-            <w:t>HAL_OK</w:t>
-          </w:r>
-          <w:r>
-            <w:rPr>
-              <w:rFonts w:hint="eastAsia" w:ascii="Consolas" w:eastAsia="宋体" w:hAnsiTheme="minorAscii" w:cstheme="minorBidi"/>
-              <w:color w:val="252525"/>
-              <w:kern w:val="2"/>
-              <w:sz w:val="21"/>
-              <w:szCs w:val="24"/>
-              <w:shd w:val="clear"/>
-              <w:lang w:val="en-US" w:eastAsia="zh-CN" w:bidi="ar-SA"/>
-            </w:rPr>
-            <w:t xml:space="preserve">       = </w:t>
-          </w:r>
-          <w:r>
-            <w:rPr>
-              <w:rFonts w:hint="eastAsia" w:ascii="Consolas" w:eastAsia="宋体" w:hAnsiTheme="minorAscii" w:cstheme="minorBidi"/>
-              <w:color w:val="C48200"/>
-              <w:kern w:val="2"/>
-              <w:sz w:val="21"/>
-              <w:szCs w:val="24"/>
-              <w:shd w:val="clear"/>
-              <w:lang w:val="en-US" w:eastAsia="zh-CN" w:bidi="ar-SA"/>
-            </w:rPr>
-            <w:t>0x00U</w:t>
-          </w:r>
-          <w:r>
-            <w:rPr>
-              <w:rFonts w:hint="eastAsia" w:ascii="Consolas" w:eastAsia="宋体" w:hAnsiTheme="minorAscii" w:cstheme="minorBidi"/>
-              <w:color w:val="252525"/>
-              <w:kern w:val="2"/>
-              <w:sz w:val="21"/>
-              <w:szCs w:val="24"/>
-              <w:shd w:val="clear"/>
-              <w:lang w:val="en-US" w:eastAsia="zh-CN" w:bidi="ar-SA"/>
-            </w:rPr>
-            <w:t>,</w:t>
-          </w:r>
-        </w:p>
-        <w:p>
-          <w:pPr>
-            <w:shd w:val="clear" w:fill="F5F5F5"/>
-            <w:bidi w:val="0"/>
-            <w:ind w:left="480" w:leftChars="200"/>
-            <w:rPr>
-              <w:rFonts w:hint="eastAsia" w:ascii="Consolas" w:eastAsia="宋体" w:hAnsiTheme="minorAscii" w:cstheme="minorBidi"/>
-              <w:color w:val="252525"/>
-              <w:kern w:val="2"/>
-              <w:sz w:val="21"/>
-              <w:szCs w:val="24"/>
-              <w:shd w:val="clear"/>
-              <w:lang w:val="en-US" w:eastAsia="zh-CN" w:bidi="ar-SA"/>
-            </w:rPr>
-          </w:pPr>
-          <w:r>
-            <w:rPr>
-              <w:rFonts w:hint="eastAsia" w:ascii="Consolas" w:eastAsia="宋体" w:hAnsiTheme="minorAscii" w:cstheme="minorBidi"/>
-              <w:color w:val="252525"/>
-              <w:kern w:val="2"/>
-              <w:sz w:val="21"/>
-              <w:szCs w:val="24"/>
-              <w:shd w:val="clear"/>
-              <w:lang w:val="en-US" w:eastAsia="zh-CN" w:bidi="ar-SA"/>
-            </w:rPr>
-            <w:t xml:space="preserve">  </w:t>
-          </w:r>
-          <w:r>
-            <w:rPr>
-              <w:rFonts w:hint="eastAsia" w:ascii="Consolas" w:eastAsia="宋体" w:hAnsiTheme="minorAscii" w:cstheme="minorBidi"/>
-              <w:color w:val="BB2726"/>
-              <w:kern w:val="2"/>
-              <w:sz w:val="21"/>
-              <w:szCs w:val="24"/>
-              <w:shd w:val="clear"/>
-              <w:lang w:val="en-US" w:eastAsia="zh-CN" w:bidi="ar-SA"/>
-            </w:rPr>
-            <w:t>HAL_ERROR</w:t>
-          </w:r>
-          <w:r>
-            <w:rPr>
-              <w:rFonts w:hint="eastAsia" w:ascii="Consolas" w:eastAsia="宋体" w:hAnsiTheme="minorAscii" w:cstheme="minorBidi"/>
-              <w:color w:val="252525"/>
-              <w:kern w:val="2"/>
-              <w:sz w:val="21"/>
-              <w:szCs w:val="24"/>
-              <w:shd w:val="clear"/>
-              <w:lang w:val="en-US" w:eastAsia="zh-CN" w:bidi="ar-SA"/>
-            </w:rPr>
-            <w:t xml:space="preserve">    = </w:t>
-          </w:r>
-          <w:r>
-            <w:rPr>
-              <w:rFonts w:hint="eastAsia" w:ascii="Consolas" w:eastAsia="宋体" w:hAnsiTheme="minorAscii" w:cstheme="minorBidi"/>
-              <w:color w:val="C48200"/>
-              <w:kern w:val="2"/>
-              <w:sz w:val="21"/>
-              <w:szCs w:val="24"/>
-              <w:shd w:val="clear"/>
-              <w:lang w:val="en-US" w:eastAsia="zh-CN" w:bidi="ar-SA"/>
-            </w:rPr>
-            <w:t>0x01U</w:t>
-          </w:r>
-          <w:r>
-            <w:rPr>
-              <w:rFonts w:hint="eastAsia" w:ascii="Consolas" w:eastAsia="宋体" w:hAnsiTheme="minorAscii" w:cstheme="minorBidi"/>
-              <w:color w:val="252525"/>
-              <w:kern w:val="2"/>
-              <w:sz w:val="21"/>
-              <w:szCs w:val="24"/>
-              <w:shd w:val="clear"/>
-              <w:lang w:val="en-US" w:eastAsia="zh-CN" w:bidi="ar-SA"/>
-            </w:rPr>
-            <w:t>,</w:t>
-          </w:r>
-        </w:p>
-        <w:p>
-          <w:pPr>
-            <w:shd w:val="clear" w:fill="F5F5F5"/>
-            <w:bidi w:val="0"/>
-            <w:ind w:left="480" w:leftChars="200"/>
-            <w:rPr>
-              <w:rFonts w:hint="eastAsia" w:ascii="Consolas" w:eastAsia="宋体" w:hAnsiTheme="minorAscii" w:cstheme="minorBidi"/>
-              <w:color w:val="252525"/>
-              <w:kern w:val="2"/>
-              <w:sz w:val="21"/>
-              <w:szCs w:val="24"/>
-              <w:shd w:val="clear"/>
-              <w:lang w:val="en-US" w:eastAsia="zh-CN" w:bidi="ar-SA"/>
-            </w:rPr>
-          </w:pPr>
-          <w:r>
-            <w:rPr>
-              <w:rFonts w:hint="eastAsia" w:ascii="Consolas" w:eastAsia="宋体" w:hAnsiTheme="minorAscii" w:cstheme="minorBidi"/>
-              <w:color w:val="252525"/>
-              <w:kern w:val="2"/>
-              <w:sz w:val="21"/>
-              <w:szCs w:val="24"/>
-              <w:shd w:val="clear"/>
-              <w:lang w:val="en-US" w:eastAsia="zh-CN" w:bidi="ar-SA"/>
-            </w:rPr>
-            <w:t xml:space="preserve">  </w:t>
-          </w:r>
-          <w:r>
-            <w:rPr>
-              <w:rFonts w:hint="eastAsia" w:ascii="Consolas" w:eastAsia="宋体" w:hAnsiTheme="minorAscii" w:cstheme="minorBidi"/>
-              <w:color w:val="BB2726"/>
-              <w:kern w:val="2"/>
-              <w:sz w:val="21"/>
-              <w:szCs w:val="24"/>
-              <w:shd w:val="clear"/>
-              <w:lang w:val="en-US" w:eastAsia="zh-CN" w:bidi="ar-SA"/>
-            </w:rPr>
-            <w:t>HAL_BUSY</w:t>
-          </w:r>
-          <w:r>
-            <w:rPr>
-              <w:rFonts w:hint="eastAsia" w:ascii="Consolas" w:eastAsia="宋体" w:hAnsiTheme="minorAscii" w:cstheme="minorBidi"/>
-              <w:color w:val="252525"/>
-              <w:kern w:val="2"/>
-              <w:sz w:val="21"/>
-              <w:szCs w:val="24"/>
-              <w:shd w:val="clear"/>
-              <w:lang w:val="en-US" w:eastAsia="zh-CN" w:bidi="ar-SA"/>
-            </w:rPr>
-            <w:t xml:space="preserve">     = </w:t>
-          </w:r>
-          <w:r>
-            <w:rPr>
-              <w:rFonts w:hint="eastAsia" w:ascii="Consolas" w:eastAsia="宋体" w:hAnsiTheme="minorAscii" w:cstheme="minorBidi"/>
-              <w:color w:val="C48200"/>
-              <w:kern w:val="2"/>
-              <w:sz w:val="21"/>
-              <w:szCs w:val="24"/>
-              <w:shd w:val="clear"/>
-              <w:lang w:val="en-US" w:eastAsia="zh-CN" w:bidi="ar-SA"/>
-            </w:rPr>
-            <w:t>0x02U</w:t>
-          </w:r>
-          <w:r>
-            <w:rPr>
-              <w:rFonts w:hint="eastAsia" w:ascii="Consolas" w:eastAsia="宋体" w:hAnsiTheme="minorAscii" w:cstheme="minorBidi"/>
-              <w:color w:val="252525"/>
-              <w:kern w:val="2"/>
-              <w:sz w:val="21"/>
-              <w:szCs w:val="24"/>
-              <w:shd w:val="clear"/>
-              <w:lang w:val="en-US" w:eastAsia="zh-CN" w:bidi="ar-SA"/>
-            </w:rPr>
-            <w:t>,</w:t>
-          </w:r>
-        </w:p>
-        <w:p>
-          <w:pPr>
-            <w:shd w:val="clear" w:fill="F5F5F5"/>
-            <w:bidi w:val="0"/>
-            <w:ind w:left="480" w:leftChars="200"/>
-            <w:rPr>
-              <w:rFonts w:hint="eastAsia" w:ascii="Consolas" w:eastAsia="宋体" w:hAnsiTheme="minorAscii" w:cstheme="minorBidi"/>
-              <w:color w:val="252525"/>
-              <w:kern w:val="2"/>
-              <w:sz w:val="21"/>
-              <w:szCs w:val="24"/>
-              <w:shd w:val="clear"/>
-              <w:lang w:val="en-US" w:eastAsia="zh-CN" w:bidi="ar-SA"/>
-            </w:rPr>
-          </w:pPr>
-          <w:r>
-            <w:rPr>
-              <w:rFonts w:hint="eastAsia" w:ascii="Consolas" w:eastAsia="宋体" w:hAnsiTheme="minorAscii" w:cstheme="minorBidi"/>
-              <w:color w:val="252525"/>
-              <w:kern w:val="2"/>
-              <w:sz w:val="21"/>
-              <w:szCs w:val="24"/>
-              <w:shd w:val="clear"/>
-              <w:lang w:val="en-US" w:eastAsia="zh-CN" w:bidi="ar-SA"/>
-            </w:rPr>
-            <w:t xml:space="preserve">  </w:t>
-          </w:r>
-          <w:r>
-            <w:rPr>
-              <w:rFonts w:hint="eastAsia" w:ascii="Consolas" w:eastAsia="宋体" w:hAnsiTheme="minorAscii" w:cstheme="minorBidi"/>
-              <w:color w:val="BB2726"/>
-              <w:kern w:val="2"/>
-              <w:sz w:val="21"/>
-              <w:szCs w:val="24"/>
-              <w:shd w:val="clear"/>
-              <w:lang w:val="en-US" w:eastAsia="zh-CN" w:bidi="ar-SA"/>
-            </w:rPr>
-            <w:t>HAL_TIMEOUT</w:t>
-          </w:r>
-          <w:r>
-            <w:rPr>
-              <w:rFonts w:hint="eastAsia" w:ascii="Consolas" w:eastAsia="宋体" w:hAnsiTheme="minorAscii" w:cstheme="minorBidi"/>
-              <w:color w:val="252525"/>
-              <w:kern w:val="2"/>
-              <w:sz w:val="21"/>
-              <w:szCs w:val="24"/>
-              <w:shd w:val="clear"/>
-              <w:lang w:val="en-US" w:eastAsia="zh-CN" w:bidi="ar-SA"/>
-            </w:rPr>
-            <w:t xml:space="preserve">  = </w:t>
-          </w:r>
-          <w:r>
-            <w:rPr>
-              <w:rFonts w:hint="eastAsia" w:ascii="Consolas" w:eastAsia="宋体" w:hAnsiTheme="minorAscii" w:cstheme="minorBidi"/>
-              <w:color w:val="C48200"/>
-              <w:kern w:val="2"/>
-              <w:sz w:val="21"/>
-              <w:szCs w:val="24"/>
-              <w:shd w:val="clear"/>
-              <w:lang w:val="en-US" w:eastAsia="zh-CN" w:bidi="ar-SA"/>
-            </w:rPr>
-            <w:t>0x03U</w:t>
-          </w:r>
-        </w:p>
-        <w:p>
-          <w:pPr>
-            <w:shd w:val="clear" w:fill="F5F5F5"/>
-            <w:bidi w:val="0"/>
-            <w:ind w:left="480" w:leftChars="200"/>
-            <w:rPr>
-              <w:rFonts w:ascii="Consolas"/>
-              <w:sz w:val="21"/>
-              <w:shd w:val="clear"/>
-            </w:rPr>
-          </w:pPr>
-          <w:r>
-            <w:rPr>
-              <w:rFonts w:hint="eastAsia" w:ascii="Consolas" w:eastAsia="宋体" w:hAnsiTheme="minorAscii" w:cstheme="minorBidi"/>
-              <w:color w:val="252525"/>
-              <w:kern w:val="2"/>
-              <w:sz w:val="21"/>
-              <w:szCs w:val="24"/>
-              <w:shd w:val="clear"/>
-              <w:lang w:val="en-US" w:eastAsia="zh-CN" w:bidi="ar-SA"/>
-            </w:rPr>
-            <w:t xml:space="preserve">} </w:t>
-          </w:r>
-          <w:r>
-            <w:rPr>
-              <w:rFonts w:hint="eastAsia" w:ascii="Consolas" w:eastAsia="宋体" w:hAnsiTheme="minorAscii" w:cstheme="minorBidi"/>
-              <w:color w:val="347317"/>
-              <w:kern w:val="2"/>
-              <w:sz w:val="21"/>
-              <w:szCs w:val="24"/>
-              <w:shd w:val="clear"/>
-              <w:lang w:val="en-US" w:eastAsia="zh-CN" w:bidi="ar-SA"/>
-            </w:rPr>
-            <w:t>HAL_StatusTypeDef</w:t>
-          </w:r>
-          <w:r>
-            <w:rPr>
-              <w:rFonts w:hint="eastAsia" w:ascii="Consolas" w:eastAsia="宋体" w:hAnsiTheme="minorAscii" w:cstheme="minorBidi"/>
-              <w:color w:val="252525"/>
-              <w:kern w:val="2"/>
-              <w:sz w:val="21"/>
-              <w:szCs w:val="24"/>
-              <w:shd w:val="clear"/>
-              <w:lang w:val="en-US" w:eastAsia="zh-CN" w:bidi="ar-SA"/>
-            </w:rPr>
-            <w:t>;</w:t>
-          </w:r>
-        </w:p>
-      </w:sdtContent>
-    </w:sdt>
     <w:p>
       <w:pPr>
-        <w:pStyle w:val="3"/>
         <w:bidi w:val="0"/>
         <w:rPr>
           <w:rFonts w:hint="eastAsia"/>
@@ -947,10 +308,50 @@
       </w:pPr>
       <w:r>
         <w:rPr>
+          <w:rFonts w:hint="default" w:ascii="Symbol" w:hAnsi="Symbol" w:eastAsia="宋体" w:cs="Symbol"/>
+          <w:b w:val="0"/>
+          <w:bCs w:val="0"/>
+          <w:kern w:val="2"/>
+          <w:sz w:val="20"/>
+          <w:szCs w:val="24"/>
+          <w:lang w:val="en-US" w:eastAsia="zh-CN" w:bidi="ar-SA"/>
+        </w:rPr>
+        <w:t></w:t>
+      </w:r>
+      <w:r>
+        <w:rPr>
           <w:rFonts w:hint="eastAsia"/>
           <w:lang w:val="en-US" w:eastAsia="zh-CN"/>
         </w:rPr>
-        <w:t>简单案例</w:t>
+        <w:t>参数：串口句柄指针、数据指针、数据长度、超时时间。</w:t>
+      </w:r>
+    </w:p>
+    <w:p>
+      <w:pPr>
+        <w:bidi w:val="0"/>
+        <w:rPr>
+          <w:rFonts w:hint="eastAsia"/>
+          <w:lang w:val="en-US" w:eastAsia="zh-CN"/>
+        </w:rPr>
+      </w:pPr>
+      <w:r>
+        <w:rPr>
+          <w:rFonts w:hint="default" w:ascii="Symbol" w:hAnsi="Symbol" w:eastAsia="宋体" w:cs="Symbol"/>
+          <w:b w:val="0"/>
+          <w:bCs w:val="0"/>
+          <w:kern w:val="2"/>
+          <w:sz w:val="20"/>
+          <w:szCs w:val="24"/>
+          <w:lang w:val="en-US" w:eastAsia="zh-CN" w:bidi="ar-SA"/>
+        </w:rPr>
+        <w:t></w:t>
+      </w:r>
+      <w:r>
+        <w:rPr>
+          <w:rFonts w:hint="eastAsia"/>
+          <w:lang w:val="en-US" w:eastAsia="zh-CN"/>
+        </w:rPr>
+        <w:t>返回值：HAL状态。</w:t>
       </w:r>
     </w:p>
     <w:sdt>
@@ -963,9 +364,9 @@
           <w:shd w:val="clear"/>
           <w:lang w:val="en-US" w:eastAsia="zh-CN" w:bidi="ar-SA"/>
         </w:rPr>
-        <w:id w:val="147463612"/>
+        <w:id w:val="147463685"/>
         <w:placeholder>
-          <w:docPart w:val="{dc17a641-5f22-4a5e-b07b-b4ae355146a4}"/>
+          <w:docPart w:val="{e7d2a870-5b08-477d-a561-9c7a2eb5ece8}"/>
         </w:placeholder>
         <w15:appearance w15:val="hidden"/>
       </w:sdtPr>
@@ -1152,7 +553,983 @@
     </w:sdt>
     <w:p>
       <w:pPr>
-        <w:pStyle w:val="3"/>
+        <w:bidi w:val="0"/>
+        <w:rPr>
+          <w:rFonts w:hint="eastAsia"/>
+          <w:lang w:val="en-US" w:eastAsia="zh-CN"/>
+        </w:rPr>
+      </w:pPr>
+    </w:p>
+    <w:p>
+      <w:pPr>
+        <w:pStyle w:val="2"/>
+        <w:bidi w:val="0"/>
+        <w:rPr>
+          <w:rFonts w:hint="eastAsia"/>
+          <w:lang w:val="en-US" w:eastAsia="zh-CN"/>
+        </w:rPr>
+      </w:pPr>
+      <w:r>
+        <w:rPr>
+          <w:rFonts w:hint="eastAsia"/>
+          <w:lang w:val="en-US" w:eastAsia="zh-CN"/>
+        </w:rPr>
+        <w:t>HAL_UART_Receive()</w:t>
+      </w:r>
+    </w:p>
+    <w:p>
+      <w:pPr>
+        <w:bidi w:val="0"/>
+        <w:rPr>
+          <w:rFonts w:hint="eastAsia"/>
+          <w:lang w:val="en-US" w:eastAsia="zh-CN"/>
+        </w:rPr>
+      </w:pPr>
+      <w:r>
+        <w:rPr>
+          <w:rFonts w:hint="default" w:ascii="Symbol" w:hAnsi="Symbol" w:eastAsia="宋体" w:cs="Symbol"/>
+          <w:b w:val="0"/>
+          <w:bCs w:val="0"/>
+          <w:kern w:val="2"/>
+          <w:sz w:val="20"/>
+          <w:szCs w:val="24"/>
+          <w:lang w:val="en-US" w:eastAsia="zh-CN" w:bidi="ar-SA"/>
+        </w:rPr>
+        <w:t></w:t>
+      </w:r>
+      <w:r>
+        <w:rPr>
+          <w:rFonts w:hint="eastAsia"/>
+          <w:lang w:val="en-US" w:eastAsia="zh-CN"/>
+        </w:rPr>
+        <w:t>功能：以阻塞模式接收数据（不推荐，可能阻塞程序）。</w:t>
+      </w:r>
+    </w:p>
+    <w:p>
+      <w:pPr>
+        <w:bidi w:val="0"/>
+        <w:rPr>
+          <w:rFonts w:hint="eastAsia"/>
+          <w:lang w:val="en-US" w:eastAsia="zh-CN"/>
+        </w:rPr>
+      </w:pPr>
+      <w:r>
+        <w:rPr>
+          <w:rFonts w:hint="default" w:ascii="Symbol" w:hAnsi="Symbol" w:eastAsia="宋体" w:cs="Symbol"/>
+          <w:b w:val="0"/>
+          <w:bCs w:val="0"/>
+          <w:kern w:val="2"/>
+          <w:sz w:val="20"/>
+          <w:szCs w:val="24"/>
+          <w:lang w:val="en-US" w:eastAsia="zh-CN" w:bidi="ar-SA"/>
+        </w:rPr>
+        <w:t></w:t>
+      </w:r>
+      <w:r>
+        <w:rPr>
+          <w:rFonts w:hint="eastAsia"/>
+          <w:lang w:val="en-US" w:eastAsia="zh-CN"/>
+        </w:rPr>
+        <w:t>参数：串口句柄指针、数据缓冲区指针、数据长度、超时时间。</w:t>
+      </w:r>
+    </w:p>
+    <w:p>
+      <w:pPr>
+        <w:bidi w:val="0"/>
+        <w:rPr>
+          <w:rFonts w:hint="eastAsia"/>
+          <w:lang w:val="en-US" w:eastAsia="zh-CN"/>
+        </w:rPr>
+      </w:pPr>
+      <w:r>
+        <w:rPr>
+          <w:rFonts w:hint="default" w:ascii="Symbol" w:hAnsi="Symbol" w:eastAsia="宋体" w:cs="Symbol"/>
+          <w:b w:val="0"/>
+          <w:bCs w:val="0"/>
+          <w:kern w:val="2"/>
+          <w:sz w:val="20"/>
+          <w:szCs w:val="24"/>
+          <w:lang w:val="en-US" w:eastAsia="zh-CN" w:bidi="ar-SA"/>
+        </w:rPr>
+        <w:t></w:t>
+      </w:r>
+      <w:r>
+        <w:rPr>
+          <w:rFonts w:hint="eastAsia"/>
+          <w:lang w:val="en-US" w:eastAsia="zh-CN"/>
+        </w:rPr>
+        <w:t>返回值：HAL状态。</w:t>
+      </w:r>
+    </w:p>
+    <w:sdt>
+      <w:sdtPr>
+        <w:rPr>
+          <w:rFonts w:hint="eastAsia" w:ascii="Consolas" w:eastAsia="宋体" w:hAnsiTheme="minorAscii" w:cstheme="minorBidi"/>
+          <w:kern w:val="2"/>
+          <w:sz w:val="21"/>
+          <w:szCs w:val="24"/>
+          <w:shd w:val="clear"/>
+          <w:lang w:val="en-US" w:eastAsia="zh-CN" w:bidi="ar-SA"/>
+        </w:rPr>
+        <w:id w:val="147460478"/>
+        <w:placeholder>
+          <w:docPart w:val="{499d38ec-73a6-4cbb-8297-49484accb8eb}"/>
+        </w:placeholder>
+        <w15:appearance w15:val="hidden"/>
+      </w:sdtPr>
+      <w:sdtEndPr>
+        <w:rPr>
+          <w:rFonts w:hint="eastAsia" w:ascii="Consolas" w:eastAsia="宋体" w:hAnsiTheme="minorAscii" w:cstheme="minorBidi"/>
+          <w:kern w:val="2"/>
+          <w:sz w:val="21"/>
+          <w:szCs w:val="24"/>
+          <w:shd w:val="clear"/>
+          <w:lang w:val="en-US" w:eastAsia="zh-CN" w:bidi="ar-SA"/>
+        </w:rPr>
+      </w:sdtEndPr>
+      <w:sdtContent>
+        <w:p>
+          <w:pPr>
+            <w:shd w:val="clear" w:fill="F5F5F5"/>
+            <w:bidi w:val="0"/>
+            <w:ind w:left="480" w:leftChars="200"/>
+            <w:rPr>
+              <w:rFonts w:hint="eastAsia" w:ascii="Consolas"/>
+              <w:sz w:val="21"/>
+              <w:shd w:val="clear"/>
+              <w:lang w:val="en-US" w:eastAsia="zh-CN"/>
+            </w:rPr>
+          </w:pPr>
+          <w:r>
+            <w:rPr>
+              <w:rFonts w:hint="eastAsia" w:ascii="Consolas" w:eastAsia="宋体" w:hAnsiTheme="minorAscii" w:cstheme="minorBidi"/>
+              <w:color w:val="BB2726"/>
+              <w:kern w:val="2"/>
+              <w:sz w:val="21"/>
+              <w:szCs w:val="24"/>
+              <w:shd w:val="clear"/>
+              <w:lang w:val="en-US" w:eastAsia="zh-CN" w:bidi="ar-SA"/>
+            </w:rPr>
+            <w:t>HAL_UART_Receive</w:t>
+          </w:r>
+          <w:r>
+            <w:rPr>
+              <w:rFonts w:hint="eastAsia" w:ascii="Consolas" w:eastAsia="宋体" w:hAnsiTheme="minorAscii" w:cstheme="minorBidi"/>
+              <w:color w:val="252525"/>
+              <w:kern w:val="2"/>
+              <w:sz w:val="21"/>
+              <w:szCs w:val="24"/>
+              <w:shd w:val="clear"/>
+              <w:lang w:val="en-US" w:eastAsia="zh-CN" w:bidi="ar-SA"/>
+            </w:rPr>
+            <w:t>(&amp;</w:t>
+          </w:r>
+          <w:r>
+            <w:rPr>
+              <w:rFonts w:hint="eastAsia" w:ascii="Consolas" w:eastAsia="宋体" w:hAnsiTheme="minorAscii" w:cstheme="minorBidi"/>
+              <w:color w:val="BB2726"/>
+              <w:kern w:val="2"/>
+              <w:sz w:val="21"/>
+              <w:szCs w:val="24"/>
+              <w:shd w:val="clear"/>
+              <w:lang w:val="en-US" w:eastAsia="zh-CN" w:bidi="ar-SA"/>
+            </w:rPr>
+            <w:t>huart2</w:t>
+          </w:r>
+          <w:r>
+            <w:rPr>
+              <w:rFonts w:hint="eastAsia" w:ascii="Consolas" w:eastAsia="宋体" w:hAnsiTheme="minorAscii" w:cstheme="minorBidi"/>
+              <w:color w:val="252525"/>
+              <w:kern w:val="2"/>
+              <w:sz w:val="21"/>
+              <w:szCs w:val="24"/>
+              <w:shd w:val="clear"/>
+              <w:lang w:val="en-US" w:eastAsia="zh-CN" w:bidi="ar-SA"/>
+            </w:rPr>
+            <w:t xml:space="preserve">, </w:t>
+          </w:r>
+          <w:r>
+            <w:rPr>
+              <w:rFonts w:hint="eastAsia" w:ascii="Consolas" w:eastAsia="宋体" w:hAnsiTheme="minorAscii" w:cstheme="minorBidi"/>
+              <w:color w:val="BB2726"/>
+              <w:kern w:val="2"/>
+              <w:sz w:val="21"/>
+              <w:szCs w:val="24"/>
+              <w:shd w:val="clear"/>
+              <w:lang w:val="en-US" w:eastAsia="zh-CN" w:bidi="ar-SA"/>
+            </w:rPr>
+            <w:t>recv_buf</w:t>
+          </w:r>
+          <w:r>
+            <w:rPr>
+              <w:rFonts w:hint="eastAsia" w:ascii="Consolas" w:eastAsia="宋体" w:hAnsiTheme="minorAscii" w:cstheme="minorBidi"/>
+              <w:color w:val="252525"/>
+              <w:kern w:val="2"/>
+              <w:sz w:val="21"/>
+              <w:szCs w:val="24"/>
+              <w:shd w:val="clear"/>
+              <w:lang w:val="en-US" w:eastAsia="zh-CN" w:bidi="ar-SA"/>
+            </w:rPr>
+            <w:t xml:space="preserve">, </w:t>
+          </w:r>
+          <w:r>
+            <w:rPr>
+              <w:rFonts w:hint="eastAsia" w:ascii="Consolas" w:eastAsia="宋体" w:hAnsiTheme="minorAscii" w:cstheme="minorBidi"/>
+              <w:color w:val="C48200"/>
+              <w:kern w:val="2"/>
+              <w:sz w:val="21"/>
+              <w:szCs w:val="24"/>
+              <w:shd w:val="clear"/>
+              <w:lang w:val="en-US" w:eastAsia="zh-CN" w:bidi="ar-SA"/>
+            </w:rPr>
+            <w:t>10</w:t>
+          </w:r>
+          <w:r>
+            <w:rPr>
+              <w:rFonts w:hint="eastAsia" w:ascii="Consolas" w:eastAsia="宋体" w:hAnsiTheme="minorAscii" w:cstheme="minorBidi"/>
+              <w:color w:val="252525"/>
+              <w:kern w:val="2"/>
+              <w:sz w:val="21"/>
+              <w:szCs w:val="24"/>
+              <w:shd w:val="clear"/>
+              <w:lang w:val="en-US" w:eastAsia="zh-CN" w:bidi="ar-SA"/>
+            </w:rPr>
+            <w:t xml:space="preserve">, </w:t>
+          </w:r>
+          <w:r>
+            <w:rPr>
+              <w:rFonts w:hint="eastAsia" w:ascii="Consolas" w:eastAsia="宋体" w:hAnsiTheme="minorAscii" w:cstheme="minorBidi"/>
+              <w:color w:val="C48200"/>
+              <w:kern w:val="2"/>
+              <w:sz w:val="21"/>
+              <w:szCs w:val="24"/>
+              <w:shd w:val="clear"/>
+              <w:lang w:val="en-US" w:eastAsia="zh-CN" w:bidi="ar-SA"/>
+            </w:rPr>
+            <w:t>1000</w:t>
+          </w:r>
+          <w:r>
+            <w:rPr>
+              <w:rFonts w:hint="eastAsia" w:ascii="Consolas" w:eastAsia="宋体" w:hAnsiTheme="minorAscii" w:cstheme="minorBidi"/>
+              <w:color w:val="252525"/>
+              <w:kern w:val="2"/>
+              <w:sz w:val="21"/>
+              <w:szCs w:val="24"/>
+              <w:shd w:val="clear"/>
+              <w:lang w:val="en-US" w:eastAsia="zh-CN" w:bidi="ar-SA"/>
+            </w:rPr>
+            <w:t>);</w:t>
+          </w:r>
+        </w:p>
+      </w:sdtContent>
+    </w:sdt>
+    <w:p>
+      <w:pPr>
+        <w:pStyle w:val="2"/>
+        <w:bidi w:val="0"/>
+        <w:rPr>
+          <w:rFonts w:hint="eastAsia"/>
+          <w:lang w:val="en-US" w:eastAsia="zh-CN"/>
+        </w:rPr>
+      </w:pPr>
+      <w:r>
+        <w:rPr>
+          <w:rFonts w:hint="eastAsia"/>
+          <w:lang w:val="en-US" w:eastAsia="zh-CN"/>
+        </w:rPr>
+        <w:t>HAL_UART_Transmit_IT()</w:t>
+      </w:r>
+    </w:p>
+    <w:p>
+      <w:pPr>
+        <w:bidi w:val="0"/>
+        <w:rPr>
+          <w:rFonts w:hint="eastAsia"/>
+          <w:lang w:val="en-US" w:eastAsia="zh-CN"/>
+        </w:rPr>
+      </w:pPr>
+      <w:r>
+        <w:rPr>
+          <w:rFonts w:hint="default" w:ascii="Symbol" w:hAnsi="Symbol" w:eastAsia="宋体" w:cs="Symbol"/>
+          <w:b w:val="0"/>
+          <w:bCs w:val="0"/>
+          <w:kern w:val="2"/>
+          <w:sz w:val="20"/>
+          <w:szCs w:val="24"/>
+          <w:lang w:val="en-US" w:eastAsia="zh-CN" w:bidi="ar-SA"/>
+        </w:rPr>
+        <w:t></w:t>
+      </w:r>
+      <w:r>
+        <w:rPr>
+          <w:rFonts w:hint="eastAsia"/>
+          <w:lang w:val="en-US" w:eastAsia="zh-CN"/>
+        </w:rPr>
+        <w:t>功能：以中断模式发送数据。</w:t>
+      </w:r>
+    </w:p>
+    <w:p>
+      <w:pPr>
+        <w:bidi w:val="0"/>
+        <w:rPr>
+          <w:rFonts w:hint="eastAsia"/>
+          <w:lang w:val="en-US" w:eastAsia="zh-CN"/>
+        </w:rPr>
+      </w:pPr>
+      <w:r>
+        <w:rPr>
+          <w:rFonts w:hint="default" w:ascii="Symbol" w:hAnsi="Symbol" w:eastAsia="宋体" w:cs="Symbol"/>
+          <w:b w:val="0"/>
+          <w:bCs w:val="0"/>
+          <w:kern w:val="2"/>
+          <w:sz w:val="20"/>
+          <w:szCs w:val="24"/>
+          <w:lang w:val="en-US" w:eastAsia="zh-CN" w:bidi="ar-SA"/>
+        </w:rPr>
+        <w:t></w:t>
+      </w:r>
+      <w:r>
+        <w:rPr>
+          <w:rFonts w:hint="eastAsia"/>
+          <w:lang w:val="en-US" w:eastAsia="zh-CN"/>
+        </w:rPr>
+        <w:t>参数：串口句柄指针、数据指针、数据长度。</w:t>
+      </w:r>
+    </w:p>
+    <w:p>
+      <w:pPr>
+        <w:bidi w:val="0"/>
+        <w:rPr>
+          <w:rFonts w:hint="eastAsia"/>
+          <w:lang w:val="en-US" w:eastAsia="zh-CN"/>
+        </w:rPr>
+      </w:pPr>
+      <w:r>
+        <w:rPr>
+          <w:rFonts w:hint="default" w:ascii="Symbol" w:hAnsi="Symbol" w:eastAsia="宋体" w:cs="Symbol"/>
+          <w:b w:val="0"/>
+          <w:bCs w:val="0"/>
+          <w:kern w:val="2"/>
+          <w:sz w:val="20"/>
+          <w:szCs w:val="24"/>
+          <w:lang w:val="en-US" w:eastAsia="zh-CN" w:bidi="ar-SA"/>
+        </w:rPr>
+        <w:t></w:t>
+      </w:r>
+      <w:r>
+        <w:rPr>
+          <w:rFonts w:hint="eastAsia"/>
+          <w:lang w:val="en-US" w:eastAsia="zh-CN"/>
+        </w:rPr>
+        <w:t>返回值：HAL状态。</w:t>
+      </w:r>
+    </w:p>
+    <w:sdt>
+      <w:sdtPr>
+        <w:rPr>
+          <w:rFonts w:hint="eastAsia" w:ascii="Consolas" w:eastAsia="宋体" w:hAnsiTheme="minorAscii" w:cstheme="minorBidi"/>
+          <w:kern w:val="2"/>
+          <w:sz w:val="21"/>
+          <w:szCs w:val="24"/>
+          <w:shd w:val="clear"/>
+          <w:lang w:val="en-US" w:eastAsia="zh-CN" w:bidi="ar-SA"/>
+        </w:rPr>
+        <w:id w:val="147460465"/>
+        <w:placeholder>
+          <w:docPart w:val="{1b171938-2355-481f-a016-360bc1cb100a}"/>
+        </w:placeholder>
+        <w15:appearance w15:val="hidden"/>
+      </w:sdtPr>
+      <w:sdtEndPr>
+        <w:rPr>
+          <w:rFonts w:hint="eastAsia" w:ascii="Consolas" w:eastAsia="宋体" w:hAnsiTheme="minorAscii" w:cstheme="minorBidi"/>
+          <w:kern w:val="2"/>
+          <w:sz w:val="21"/>
+          <w:szCs w:val="24"/>
+          <w:shd w:val="clear"/>
+          <w:lang w:val="en-US" w:eastAsia="zh-CN" w:bidi="ar-SA"/>
+        </w:rPr>
+      </w:sdtEndPr>
+      <w:sdtContent>
+        <w:p>
+          <w:pPr>
+            <w:shd w:val="clear" w:fill="F5F5F5"/>
+            <w:bidi w:val="0"/>
+            <w:ind w:left="480" w:leftChars="200"/>
+            <w:rPr>
+              <w:rFonts w:hint="eastAsia" w:ascii="Consolas" w:eastAsia="宋体" w:hAnsiTheme="minorAscii" w:cstheme="minorBidi"/>
+              <w:color w:val="252525"/>
+              <w:kern w:val="2"/>
+              <w:sz w:val="21"/>
+              <w:szCs w:val="24"/>
+              <w:shd w:val="clear"/>
+              <w:lang w:val="en-US" w:eastAsia="zh-CN" w:bidi="ar-SA"/>
+            </w:rPr>
+          </w:pPr>
+          <w:r>
+            <w:rPr>
+              <w:rFonts w:hint="eastAsia" w:ascii="Consolas" w:eastAsia="宋体" w:hAnsiTheme="minorAscii" w:cstheme="minorBidi"/>
+              <w:color w:val="1E5FC7"/>
+              <w:kern w:val="2"/>
+              <w:sz w:val="21"/>
+              <w:szCs w:val="24"/>
+              <w:shd w:val="clear"/>
+              <w:lang w:val="en-US" w:eastAsia="zh-CN" w:bidi="ar-SA"/>
+            </w:rPr>
+            <w:t>uint8_t</w:t>
+          </w:r>
+          <w:r>
+            <w:rPr>
+              <w:rFonts w:hint="eastAsia" w:ascii="Consolas" w:eastAsia="宋体" w:hAnsiTheme="minorAscii" w:cstheme="minorBidi"/>
+              <w:color w:val="252525"/>
+              <w:kern w:val="2"/>
+              <w:sz w:val="21"/>
+              <w:szCs w:val="24"/>
+              <w:shd w:val="clear"/>
+              <w:lang w:val="en-US" w:eastAsia="zh-CN" w:bidi="ar-SA"/>
+            </w:rPr>
+            <w:t xml:space="preserve"> </w:t>
+          </w:r>
+          <w:r>
+            <w:rPr>
+              <w:rFonts w:hint="eastAsia" w:ascii="Consolas" w:eastAsia="宋体" w:hAnsiTheme="minorAscii" w:cstheme="minorBidi"/>
+              <w:color w:val="BB2726"/>
+              <w:kern w:val="2"/>
+              <w:sz w:val="21"/>
+              <w:szCs w:val="24"/>
+              <w:shd w:val="clear"/>
+              <w:lang w:val="en-US" w:eastAsia="zh-CN" w:bidi="ar-SA"/>
+            </w:rPr>
+            <w:t>tx_buf</w:t>
+          </w:r>
+          <w:r>
+            <w:rPr>
+              <w:rFonts w:hint="eastAsia" w:ascii="Consolas" w:eastAsia="宋体" w:hAnsiTheme="minorAscii" w:cstheme="minorBidi"/>
+              <w:color w:val="252525"/>
+              <w:kern w:val="2"/>
+              <w:sz w:val="21"/>
+              <w:szCs w:val="24"/>
+              <w:shd w:val="clear"/>
+              <w:lang w:val="en-US" w:eastAsia="zh-CN" w:bidi="ar-SA"/>
+            </w:rPr>
+            <w:t xml:space="preserve">[] = </w:t>
+          </w:r>
+          <w:r>
+            <w:rPr>
+              <w:rFonts w:hint="eastAsia" w:ascii="Consolas" w:eastAsia="宋体" w:hAnsiTheme="minorAscii" w:cstheme="minorBidi"/>
+              <w:color w:val="C48200"/>
+              <w:kern w:val="2"/>
+              <w:sz w:val="21"/>
+              <w:szCs w:val="24"/>
+              <w:shd w:val="clear"/>
+              <w:lang w:val="en-US" w:eastAsia="zh-CN" w:bidi="ar-SA"/>
+            </w:rPr>
+            <w:t>"IT Transmit Test\r\n"</w:t>
+          </w:r>
+          <w:r>
+            <w:rPr>
+              <w:rFonts w:hint="eastAsia" w:ascii="Consolas" w:eastAsia="宋体" w:hAnsiTheme="minorAscii" w:cstheme="minorBidi"/>
+              <w:color w:val="252525"/>
+              <w:kern w:val="2"/>
+              <w:sz w:val="21"/>
+              <w:szCs w:val="24"/>
+              <w:shd w:val="clear"/>
+              <w:lang w:val="en-US" w:eastAsia="zh-CN" w:bidi="ar-SA"/>
+            </w:rPr>
+            <w:t>;</w:t>
+          </w:r>
+        </w:p>
+        <w:p>
+          <w:pPr>
+            <w:shd w:val="clear" w:fill="F5F5F5"/>
+            <w:bidi w:val="0"/>
+            <w:ind w:left="480" w:leftChars="200"/>
+            <w:rPr>
+              <w:rFonts w:hint="eastAsia" w:ascii="Consolas"/>
+              <w:sz w:val="21"/>
+              <w:shd w:val="clear"/>
+              <w:lang w:val="en-US" w:eastAsia="zh-CN"/>
+            </w:rPr>
+          </w:pPr>
+          <w:r>
+            <w:rPr>
+              <w:rFonts w:hint="eastAsia" w:ascii="Consolas" w:eastAsia="宋体" w:hAnsiTheme="minorAscii" w:cstheme="minorBidi"/>
+              <w:color w:val="BB2726"/>
+              <w:kern w:val="2"/>
+              <w:sz w:val="21"/>
+              <w:szCs w:val="24"/>
+              <w:shd w:val="clear"/>
+              <w:lang w:val="en-US" w:eastAsia="zh-CN" w:bidi="ar-SA"/>
+            </w:rPr>
+            <w:t>HAL_UART_Transmit_IT</w:t>
+          </w:r>
+          <w:r>
+            <w:rPr>
+              <w:rFonts w:hint="eastAsia" w:ascii="Consolas" w:eastAsia="宋体" w:hAnsiTheme="minorAscii" w:cstheme="minorBidi"/>
+              <w:color w:val="252525"/>
+              <w:kern w:val="2"/>
+              <w:sz w:val="21"/>
+              <w:szCs w:val="24"/>
+              <w:shd w:val="clear"/>
+              <w:lang w:val="en-US" w:eastAsia="zh-CN" w:bidi="ar-SA"/>
+            </w:rPr>
+            <w:t>(&amp;</w:t>
+          </w:r>
+          <w:r>
+            <w:rPr>
+              <w:rFonts w:hint="eastAsia" w:ascii="Consolas" w:eastAsia="宋体" w:hAnsiTheme="minorAscii" w:cstheme="minorBidi"/>
+              <w:color w:val="BB2726"/>
+              <w:kern w:val="2"/>
+              <w:sz w:val="21"/>
+              <w:szCs w:val="24"/>
+              <w:shd w:val="clear"/>
+              <w:lang w:val="en-US" w:eastAsia="zh-CN" w:bidi="ar-SA"/>
+            </w:rPr>
+            <w:t>huart2</w:t>
+          </w:r>
+          <w:r>
+            <w:rPr>
+              <w:rFonts w:hint="eastAsia" w:ascii="Consolas" w:eastAsia="宋体" w:hAnsiTheme="minorAscii" w:cstheme="minorBidi"/>
+              <w:color w:val="252525"/>
+              <w:kern w:val="2"/>
+              <w:sz w:val="21"/>
+              <w:szCs w:val="24"/>
+              <w:shd w:val="clear"/>
+              <w:lang w:val="en-US" w:eastAsia="zh-CN" w:bidi="ar-SA"/>
+            </w:rPr>
+            <w:t xml:space="preserve">, </w:t>
+          </w:r>
+          <w:r>
+            <w:rPr>
+              <w:rFonts w:hint="eastAsia" w:ascii="Consolas" w:eastAsia="宋体" w:hAnsiTheme="minorAscii" w:cstheme="minorBidi"/>
+              <w:color w:val="BB2726"/>
+              <w:kern w:val="2"/>
+              <w:sz w:val="21"/>
+              <w:szCs w:val="24"/>
+              <w:shd w:val="clear"/>
+              <w:lang w:val="en-US" w:eastAsia="zh-CN" w:bidi="ar-SA"/>
+            </w:rPr>
+            <w:t>tx_buf</w:t>
+          </w:r>
+          <w:r>
+            <w:rPr>
+              <w:rFonts w:hint="eastAsia" w:ascii="Consolas" w:eastAsia="宋体" w:hAnsiTheme="minorAscii" w:cstheme="minorBidi"/>
+              <w:color w:val="252525"/>
+              <w:kern w:val="2"/>
+              <w:sz w:val="21"/>
+              <w:szCs w:val="24"/>
+              <w:shd w:val="clear"/>
+              <w:lang w:val="en-US" w:eastAsia="zh-CN" w:bidi="ar-SA"/>
+            </w:rPr>
+            <w:t xml:space="preserve">, </w:t>
+          </w:r>
+          <w:r>
+            <w:rPr>
+              <w:rFonts w:hint="eastAsia" w:ascii="Consolas" w:eastAsia="宋体" w:hAnsiTheme="minorAscii" w:cstheme="minorBidi"/>
+              <w:color w:val="1E5FC7"/>
+              <w:kern w:val="2"/>
+              <w:sz w:val="21"/>
+              <w:szCs w:val="24"/>
+              <w:shd w:val="clear"/>
+              <w:lang w:val="en-US" w:eastAsia="zh-CN" w:bidi="ar-SA"/>
+            </w:rPr>
+            <w:t>sizeof</w:t>
+          </w:r>
+          <w:r>
+            <w:rPr>
+              <w:rFonts w:hint="eastAsia" w:ascii="Consolas" w:eastAsia="宋体" w:hAnsiTheme="minorAscii" w:cstheme="minorBidi"/>
+              <w:color w:val="252525"/>
+              <w:kern w:val="2"/>
+              <w:sz w:val="21"/>
+              <w:szCs w:val="24"/>
+              <w:shd w:val="clear"/>
+              <w:lang w:val="en-US" w:eastAsia="zh-CN" w:bidi="ar-SA"/>
+            </w:rPr>
+            <w:t>(</w:t>
+          </w:r>
+          <w:r>
+            <w:rPr>
+              <w:rFonts w:hint="eastAsia" w:ascii="Consolas" w:eastAsia="宋体" w:hAnsiTheme="minorAscii" w:cstheme="minorBidi"/>
+              <w:color w:val="BB2726"/>
+              <w:kern w:val="2"/>
+              <w:sz w:val="21"/>
+              <w:szCs w:val="24"/>
+              <w:shd w:val="clear"/>
+              <w:lang w:val="en-US" w:eastAsia="zh-CN" w:bidi="ar-SA"/>
+            </w:rPr>
+            <w:t>tx_buf</w:t>
+          </w:r>
+          <w:r>
+            <w:rPr>
+              <w:rFonts w:hint="eastAsia" w:ascii="Consolas" w:eastAsia="宋体" w:hAnsiTheme="minorAscii" w:cstheme="minorBidi"/>
+              <w:color w:val="252525"/>
+              <w:kern w:val="2"/>
+              <w:sz w:val="21"/>
+              <w:szCs w:val="24"/>
+              <w:shd w:val="clear"/>
+              <w:lang w:val="en-US" w:eastAsia="zh-CN" w:bidi="ar-SA"/>
+            </w:rPr>
+            <w:t>)-</w:t>
+          </w:r>
+          <w:r>
+            <w:rPr>
+              <w:rFonts w:hint="eastAsia" w:ascii="Consolas" w:eastAsia="宋体" w:hAnsiTheme="minorAscii" w:cstheme="minorBidi"/>
+              <w:color w:val="C48200"/>
+              <w:kern w:val="2"/>
+              <w:sz w:val="21"/>
+              <w:szCs w:val="24"/>
+              <w:shd w:val="clear"/>
+              <w:lang w:val="en-US" w:eastAsia="zh-CN" w:bidi="ar-SA"/>
+            </w:rPr>
+            <w:t>1</w:t>
+          </w:r>
+          <w:r>
+            <w:rPr>
+              <w:rFonts w:hint="eastAsia" w:ascii="Consolas" w:eastAsia="宋体" w:hAnsiTheme="minorAscii" w:cstheme="minorBidi"/>
+              <w:color w:val="252525"/>
+              <w:kern w:val="2"/>
+              <w:sz w:val="21"/>
+              <w:szCs w:val="24"/>
+              <w:shd w:val="clear"/>
+              <w:lang w:val="en-US" w:eastAsia="zh-CN" w:bidi="ar-SA"/>
+            </w:rPr>
+            <w:t>);</w:t>
+          </w:r>
+        </w:p>
+      </w:sdtContent>
+    </w:sdt>
+    <w:p>
+      <w:pPr>
+        <w:pStyle w:val="2"/>
+        <w:bidi w:val="0"/>
+        <w:rPr>
+          <w:rFonts w:hint="eastAsia"/>
+          <w:lang w:val="en-US" w:eastAsia="zh-CN"/>
+        </w:rPr>
+      </w:pPr>
+      <w:r>
+        <w:rPr>
+          <w:rFonts w:hint="eastAsia"/>
+          <w:lang w:val="en-US" w:eastAsia="zh-CN"/>
+        </w:rPr>
+        <w:t>HAL_UART_Receive_IT()</w:t>
+      </w:r>
+    </w:p>
+    <w:p>
+      <w:pPr>
+        <w:bidi w:val="0"/>
+        <w:rPr>
+          <w:rFonts w:hint="eastAsia"/>
+          <w:lang w:val="en-US" w:eastAsia="zh-CN"/>
+        </w:rPr>
+      </w:pPr>
+      <w:r>
+        <w:rPr>
+          <w:rFonts w:hint="default" w:ascii="Symbol" w:hAnsi="Symbol" w:eastAsia="宋体" w:cs="Symbol"/>
+          <w:b w:val="0"/>
+          <w:bCs w:val="0"/>
+          <w:kern w:val="2"/>
+          <w:sz w:val="20"/>
+          <w:szCs w:val="24"/>
+          <w:lang w:val="en-US" w:eastAsia="zh-CN" w:bidi="ar-SA"/>
+        </w:rPr>
+        <w:t></w:t>
+      </w:r>
+      <w:r>
+        <w:rPr>
+          <w:rFonts w:hint="eastAsia"/>
+          <w:lang w:val="en-US" w:eastAsia="zh-CN"/>
+        </w:rPr>
+        <w:t>功能：以中断模式接收数据。</w:t>
+      </w:r>
+    </w:p>
+    <w:p>
+      <w:pPr>
+        <w:bidi w:val="0"/>
+        <w:rPr>
+          <w:rFonts w:hint="eastAsia"/>
+          <w:lang w:val="en-US" w:eastAsia="zh-CN"/>
+        </w:rPr>
+      </w:pPr>
+      <w:r>
+        <w:rPr>
+          <w:rFonts w:hint="default" w:ascii="Symbol" w:hAnsi="Symbol" w:eastAsia="宋体" w:cs="Symbol"/>
+          <w:b w:val="0"/>
+          <w:bCs w:val="0"/>
+          <w:kern w:val="2"/>
+          <w:sz w:val="20"/>
+          <w:szCs w:val="24"/>
+          <w:lang w:val="en-US" w:eastAsia="zh-CN" w:bidi="ar-SA"/>
+        </w:rPr>
+        <w:t></w:t>
+      </w:r>
+      <w:r>
+        <w:rPr>
+          <w:rFonts w:hint="eastAsia"/>
+          <w:lang w:val="en-US" w:eastAsia="zh-CN"/>
+        </w:rPr>
+        <w:t>参数：串口句柄指针、数据缓冲区指针、数据长度。</w:t>
+      </w:r>
+    </w:p>
+    <w:p>
+      <w:pPr>
+        <w:bidi w:val="0"/>
+        <w:rPr>
+          <w:rFonts w:hint="eastAsia"/>
+          <w:lang w:val="en-US" w:eastAsia="zh-CN"/>
+        </w:rPr>
+      </w:pPr>
+      <w:r>
+        <w:rPr>
+          <w:rFonts w:hint="default" w:ascii="Symbol" w:hAnsi="Symbol" w:eastAsia="宋体" w:cs="Symbol"/>
+          <w:b w:val="0"/>
+          <w:bCs w:val="0"/>
+          <w:kern w:val="2"/>
+          <w:sz w:val="20"/>
+          <w:szCs w:val="24"/>
+          <w:lang w:val="en-US" w:eastAsia="zh-CN" w:bidi="ar-SA"/>
+        </w:rPr>
+        <w:t></w:t>
+      </w:r>
+      <w:r>
+        <w:rPr>
+          <w:rFonts w:hint="eastAsia"/>
+          <w:lang w:val="en-US" w:eastAsia="zh-CN"/>
+        </w:rPr>
+        <w:t>返回值：HAL状态。</w:t>
+      </w:r>
+    </w:p>
+    <w:sdt>
+      <w:sdtPr>
+        <w:rPr>
+          <w:rFonts w:hint="eastAsia" w:ascii="Consolas" w:eastAsia="宋体" w:hAnsiTheme="minorAscii" w:cstheme="minorBidi"/>
+          <w:kern w:val="2"/>
+          <w:sz w:val="21"/>
+          <w:szCs w:val="24"/>
+          <w:shd w:val="clear"/>
+          <w:lang w:val="en-US" w:eastAsia="zh-CN" w:bidi="ar-SA"/>
+        </w:rPr>
+        <w:id w:val="147460449"/>
+        <w:placeholder>
+          <w:docPart w:val="{158c76f9-acbb-4111-967a-ee0febe84c6d}"/>
+        </w:placeholder>
+        <w15:appearance w15:val="hidden"/>
+      </w:sdtPr>
+      <w:sdtEndPr>
+        <w:rPr>
+          <w:rFonts w:hint="eastAsia" w:ascii="Consolas" w:eastAsia="宋体" w:hAnsiTheme="minorAscii" w:cstheme="minorBidi"/>
+          <w:kern w:val="2"/>
+          <w:sz w:val="21"/>
+          <w:szCs w:val="24"/>
+          <w:shd w:val="clear"/>
+          <w:lang w:val="en-US" w:eastAsia="zh-CN" w:bidi="ar-SA"/>
+        </w:rPr>
+      </w:sdtEndPr>
+      <w:sdtContent>
+        <w:p>
+          <w:pPr>
+            <w:shd w:val="clear" w:fill="F5F5F5"/>
+            <w:bidi w:val="0"/>
+            <w:ind w:left="480" w:leftChars="200"/>
+            <w:rPr>
+              <w:rFonts w:hint="eastAsia" w:ascii="Consolas" w:eastAsia="宋体" w:hAnsiTheme="minorAscii" w:cstheme="minorBidi"/>
+              <w:color w:val="252525"/>
+              <w:kern w:val="2"/>
+              <w:sz w:val="21"/>
+              <w:szCs w:val="24"/>
+              <w:shd w:val="clear"/>
+              <w:lang w:val="en-US" w:eastAsia="zh-CN" w:bidi="ar-SA"/>
+            </w:rPr>
+          </w:pPr>
+          <w:r>
+            <w:rPr>
+              <w:rFonts w:hint="eastAsia" w:ascii="Consolas" w:eastAsia="宋体" w:hAnsiTheme="minorAscii" w:cstheme="minorBidi"/>
+              <w:color w:val="1E5FC7"/>
+              <w:kern w:val="2"/>
+              <w:sz w:val="21"/>
+              <w:szCs w:val="24"/>
+              <w:shd w:val="clear"/>
+              <w:lang w:val="en-US" w:eastAsia="zh-CN" w:bidi="ar-SA"/>
+            </w:rPr>
+            <w:t>uint8_t</w:t>
+          </w:r>
+          <w:r>
+            <w:rPr>
+              <w:rFonts w:hint="eastAsia" w:ascii="Consolas" w:eastAsia="宋体" w:hAnsiTheme="minorAscii" w:cstheme="minorBidi"/>
+              <w:color w:val="252525"/>
+              <w:kern w:val="2"/>
+              <w:sz w:val="21"/>
+              <w:szCs w:val="24"/>
+              <w:shd w:val="clear"/>
+              <w:lang w:val="en-US" w:eastAsia="zh-CN" w:bidi="ar-SA"/>
+            </w:rPr>
+            <w:t xml:space="preserve"> </w:t>
+          </w:r>
+          <w:r>
+            <w:rPr>
+              <w:rFonts w:hint="eastAsia" w:ascii="Consolas" w:eastAsia="宋体" w:hAnsiTheme="minorAscii" w:cstheme="minorBidi"/>
+              <w:color w:val="BB2726"/>
+              <w:kern w:val="2"/>
+              <w:sz w:val="21"/>
+              <w:szCs w:val="24"/>
+              <w:shd w:val="clear"/>
+              <w:lang w:val="en-US" w:eastAsia="zh-CN" w:bidi="ar-SA"/>
+            </w:rPr>
+            <w:t>it_recv_buf</w:t>
+          </w:r>
+          <w:r>
+            <w:rPr>
+              <w:rFonts w:hint="eastAsia" w:ascii="Consolas" w:eastAsia="宋体" w:hAnsiTheme="minorAscii" w:cstheme="minorBidi"/>
+              <w:color w:val="252525"/>
+              <w:kern w:val="2"/>
+              <w:sz w:val="21"/>
+              <w:szCs w:val="24"/>
+              <w:shd w:val="clear"/>
+              <w:lang w:val="en-US" w:eastAsia="zh-CN" w:bidi="ar-SA"/>
+            </w:rPr>
+            <w:t>[</w:t>
+          </w:r>
+          <w:r>
+            <w:rPr>
+              <w:rFonts w:hint="eastAsia" w:ascii="Consolas" w:eastAsia="宋体" w:hAnsiTheme="minorAscii" w:cstheme="minorBidi"/>
+              <w:color w:val="C48200"/>
+              <w:kern w:val="2"/>
+              <w:sz w:val="21"/>
+              <w:szCs w:val="24"/>
+              <w:shd w:val="clear"/>
+              <w:lang w:val="en-US" w:eastAsia="zh-CN" w:bidi="ar-SA"/>
+            </w:rPr>
+            <w:t>5</w:t>
+          </w:r>
+          <w:r>
+            <w:rPr>
+              <w:rFonts w:hint="eastAsia" w:ascii="Consolas" w:eastAsia="宋体" w:hAnsiTheme="minorAscii" w:cstheme="minorBidi"/>
+              <w:color w:val="252525"/>
+              <w:kern w:val="2"/>
+              <w:sz w:val="21"/>
+              <w:szCs w:val="24"/>
+              <w:shd w:val="clear"/>
+              <w:lang w:val="en-US" w:eastAsia="zh-CN" w:bidi="ar-SA"/>
+            </w:rPr>
+            <w:t>];</w:t>
+          </w:r>
+        </w:p>
+        <w:p>
+          <w:pPr>
+            <w:shd w:val="clear" w:fill="F5F5F5"/>
+            <w:bidi w:val="0"/>
+            <w:ind w:left="480" w:leftChars="200"/>
+            <w:rPr>
+              <w:rFonts w:hint="eastAsia" w:ascii="Consolas"/>
+              <w:sz w:val="21"/>
+              <w:shd w:val="clear"/>
+              <w:lang w:val="en-US" w:eastAsia="zh-CN"/>
+            </w:rPr>
+          </w:pPr>
+          <w:r>
+            <w:rPr>
+              <w:rFonts w:hint="eastAsia" w:ascii="Consolas" w:eastAsia="宋体" w:hAnsiTheme="minorAscii" w:cstheme="minorBidi"/>
+              <w:color w:val="BB2726"/>
+              <w:kern w:val="2"/>
+              <w:sz w:val="21"/>
+              <w:szCs w:val="24"/>
+              <w:shd w:val="clear"/>
+              <w:lang w:val="en-US" w:eastAsia="zh-CN" w:bidi="ar-SA"/>
+            </w:rPr>
+            <w:t>HAL_UART_Receive_IT</w:t>
+          </w:r>
+          <w:r>
+            <w:rPr>
+              <w:rFonts w:hint="eastAsia" w:ascii="Consolas" w:eastAsia="宋体" w:hAnsiTheme="minorAscii" w:cstheme="minorBidi"/>
+              <w:color w:val="252525"/>
+              <w:kern w:val="2"/>
+              <w:sz w:val="21"/>
+              <w:szCs w:val="24"/>
+              <w:shd w:val="clear"/>
+              <w:lang w:val="en-US" w:eastAsia="zh-CN" w:bidi="ar-SA"/>
+            </w:rPr>
+            <w:t>(&amp;</w:t>
+          </w:r>
+          <w:r>
+            <w:rPr>
+              <w:rFonts w:hint="eastAsia" w:ascii="Consolas" w:eastAsia="宋体" w:hAnsiTheme="minorAscii" w:cstheme="minorBidi"/>
+              <w:color w:val="BB2726"/>
+              <w:kern w:val="2"/>
+              <w:sz w:val="21"/>
+              <w:szCs w:val="24"/>
+              <w:shd w:val="clear"/>
+              <w:lang w:val="en-US" w:eastAsia="zh-CN" w:bidi="ar-SA"/>
+            </w:rPr>
+            <w:t>huart2</w:t>
+          </w:r>
+          <w:r>
+            <w:rPr>
+              <w:rFonts w:hint="eastAsia" w:ascii="Consolas" w:eastAsia="宋体" w:hAnsiTheme="minorAscii" w:cstheme="minorBidi"/>
+              <w:color w:val="252525"/>
+              <w:kern w:val="2"/>
+              <w:sz w:val="21"/>
+              <w:szCs w:val="24"/>
+              <w:shd w:val="clear"/>
+              <w:lang w:val="en-US" w:eastAsia="zh-CN" w:bidi="ar-SA"/>
+            </w:rPr>
+            <w:t xml:space="preserve">, </w:t>
+          </w:r>
+          <w:r>
+            <w:rPr>
+              <w:rFonts w:hint="eastAsia" w:ascii="Consolas" w:eastAsia="宋体" w:hAnsiTheme="minorAscii" w:cstheme="minorBidi"/>
+              <w:color w:val="BB2726"/>
+              <w:kern w:val="2"/>
+              <w:sz w:val="21"/>
+              <w:szCs w:val="24"/>
+              <w:shd w:val="clear"/>
+              <w:lang w:val="en-US" w:eastAsia="zh-CN" w:bidi="ar-SA"/>
+            </w:rPr>
+            <w:t>it_recv_buf</w:t>
+          </w:r>
+          <w:r>
+            <w:rPr>
+              <w:rFonts w:hint="eastAsia" w:ascii="Consolas" w:eastAsia="宋体" w:hAnsiTheme="minorAscii" w:cstheme="minorBidi"/>
+              <w:color w:val="252525"/>
+              <w:kern w:val="2"/>
+              <w:sz w:val="21"/>
+              <w:szCs w:val="24"/>
+              <w:shd w:val="clear"/>
+              <w:lang w:val="en-US" w:eastAsia="zh-CN" w:bidi="ar-SA"/>
+            </w:rPr>
+            <w:t xml:space="preserve">, </w:t>
+          </w:r>
+          <w:r>
+            <w:rPr>
+              <w:rFonts w:hint="eastAsia" w:ascii="Consolas" w:eastAsia="宋体" w:hAnsiTheme="minorAscii" w:cstheme="minorBidi"/>
+              <w:color w:val="C48200"/>
+              <w:kern w:val="2"/>
+              <w:sz w:val="21"/>
+              <w:szCs w:val="24"/>
+              <w:shd w:val="clear"/>
+              <w:lang w:val="en-US" w:eastAsia="zh-CN" w:bidi="ar-SA"/>
+            </w:rPr>
+            <w:t>5</w:t>
+          </w:r>
+          <w:r>
+            <w:rPr>
+              <w:rFonts w:hint="eastAsia" w:ascii="Consolas" w:eastAsia="宋体" w:hAnsiTheme="minorAscii" w:cstheme="minorBidi"/>
+              <w:color w:val="252525"/>
+              <w:kern w:val="2"/>
+              <w:sz w:val="21"/>
+              <w:szCs w:val="24"/>
+              <w:shd w:val="clear"/>
+              <w:lang w:val="en-US" w:eastAsia="zh-CN" w:bidi="ar-SA"/>
+            </w:rPr>
+            <w:t>);</w:t>
+          </w:r>
+          <w:bookmarkStart w:id="0" w:name="_GoBack"/>
+          <w:bookmarkEnd w:id="0"/>
+        </w:p>
+      </w:sdtContent>
+    </w:sdt>
+    <w:p>
+      <w:pPr>
+        <w:pStyle w:val="2"/>
         <w:bidi w:val="0"/>
         <w:rPr>
           <w:rFonts w:hint="eastAsia"/>
@@ -1218,31 +1595,7 @@
               <w:shd w:val="clear"/>
               <w:lang w:val="en-US" w:eastAsia="zh-CN" w:bidi="ar-SA"/>
             </w:rPr>
-            <w:t>printf</w:t>
-          </w:r>
-          <w:r>
-            <w:rPr>
-              <w:rFonts w:hint="eastAsia" w:ascii="Consolas" w:eastAsia="宋体" w:hAnsiTheme="minorAscii" w:cstheme="minorBidi"/>
-              <w:color w:val="252525"/>
-              <w:kern w:val="2"/>
-              <w:sz w:val="21"/>
-              <w:szCs w:val="24"/>
-              <w:shd w:val="clear"/>
-              <w:lang w:val="en-US" w:eastAsia="zh-CN" w:bidi="ar-SA"/>
-            </w:rPr>
-            <w:t>("hello"</w:t>
-          </w:r>
-          <w:r>
-            <w:rPr>
-              <w:rFonts w:hint="eastAsia" w:ascii="Consolas" w:eastAsia="宋体" w:hAnsiTheme="minorAscii" w:cstheme="minorBidi"/>
-              <w:color w:val="252525"/>
-              <w:kern w:val="2"/>
-              <w:sz w:val="21"/>
-              <w:szCs w:val="24"/>
-              <w:shd w:val="clear"/>
-              <w:lang w:val="en-US" w:eastAsia="zh-CN" w:bidi="ar-SA"/>
-            </w:rPr>
-            <w:t>)</w:t>
+            <w:t>printf("hello")</w:t>
           </w:r>
         </w:p>
         <w:p>
@@ -1296,79 +1649,7 @@
               <w:shd w:val="clear"/>
               <w:lang w:val="en-US" w:eastAsia="zh-CN" w:bidi="ar-SA"/>
             </w:rPr>
-            <w:t>解析格式字符串，拆分出一个个字符：'h'</w:t>
-          </w:r>
-          <w:r>
-            <w:rPr>
-              <w:rFonts w:hint="eastAsia" w:ascii="Consolas" w:eastAsia="宋体" w:hAnsiTheme="minorAscii" w:cstheme="minorBidi"/>
-              <w:color w:val="252525"/>
-              <w:kern w:val="2"/>
-              <w:sz w:val="21"/>
-              <w:szCs w:val="24"/>
-              <w:shd w:val="clear"/>
-              <w:lang w:val="en-US" w:eastAsia="zh-CN" w:bidi="ar-SA"/>
-            </w:rPr>
-            <w:t xml:space="preserve"> 'e'</w:t>
-          </w:r>
-          <w:r>
-            <w:rPr>
-              <w:rFonts w:hint="eastAsia" w:ascii="Consolas" w:eastAsia="宋体" w:hAnsiTheme="minorAscii" w:cstheme="minorBidi"/>
-              <w:color w:val="252525"/>
-              <w:kern w:val="2"/>
-              <w:sz w:val="21"/>
-              <w:szCs w:val="24"/>
-              <w:shd w:val="clear"/>
-              <w:lang w:val="en-US" w:eastAsia="zh-CN" w:bidi="ar-SA"/>
-            </w:rPr>
-            <w:t xml:space="preserve"> 'l'</w:t>
-          </w:r>
-          <w:r>
-            <w:rPr>
-              <w:rFonts w:hint="eastAsia" w:ascii="Consolas" w:eastAsia="宋体" w:hAnsiTheme="minorAscii" w:cstheme="minorBidi"/>
-              <w:color w:val="252525"/>
-              <w:kern w:val="2"/>
-              <w:sz w:val="21"/>
-              <w:szCs w:val="24"/>
-              <w:shd w:val="clear"/>
-              <w:lang w:val="en-US" w:eastAsia="zh-CN" w:bidi="ar-SA"/>
-            </w:rPr>
-            <w:t xml:space="preserve"> 'l'</w:t>
-          </w:r>
-          <w:r>
-            <w:rPr>
-              <w:rFonts w:hint="eastAsia" w:ascii="Consolas" w:eastAsia="宋体" w:hAnsiTheme="minorAscii" w:cstheme="minorBidi"/>
-              <w:color w:val="252525"/>
-              <w:kern w:val="2"/>
-              <w:sz w:val="21"/>
-              <w:szCs w:val="24"/>
-              <w:shd w:val="clear"/>
-              <w:lang w:val="en-US" w:eastAsia="zh-CN" w:bidi="ar-SA"/>
-            </w:rPr>
-            <w:t xml:space="preserve"> 'o'</w:t>
-          </w:r>
-          <w:r>
-            <w:rPr>
-              <w:rFonts w:hint="eastAsia" w:ascii="Consolas" w:eastAsia="宋体" w:hAnsiTheme="minorAscii" w:cstheme="minorBidi"/>
-              <w:color w:val="252525"/>
-              <w:kern w:val="2"/>
-              <w:sz w:val="21"/>
-              <w:szCs w:val="24"/>
-              <w:shd w:val="clear"/>
-              <w:lang w:val="en-US" w:eastAsia="zh-CN" w:bidi="ar-SA"/>
-            </w:rPr>
-            <w:t xml:space="preserve"> '\r'</w:t>
-          </w:r>
-          <w:r>
-            <w:rPr>
-              <w:rFonts w:hint="eastAsia" w:ascii="Consolas" w:eastAsia="宋体" w:hAnsiTheme="minorAscii" w:cstheme="minorBidi"/>
-              <w:color w:val="252525"/>
-              <w:kern w:val="2"/>
-              <w:sz w:val="21"/>
-              <w:szCs w:val="24"/>
-              <w:shd w:val="clear"/>
-              <w:lang w:val="en-US" w:eastAsia="zh-CN" w:bidi="ar-SA"/>
-            </w:rPr>
-            <w:t xml:space="preserve"> '\n'</w:t>
+            <w:t>解析格式字符串，拆分出一个个字符：'h' 'e' 'l' 'l' 'o' '\r' '\n'</w:t>
           </w:r>
         </w:p>
         <w:p>
@@ -1422,31 +1703,7 @@
               <w:shd w:val="clear"/>
               <w:lang w:val="en-US" w:eastAsia="zh-CN" w:bidi="ar-SA"/>
             </w:rPr>
-            <w:t>循环调用</w:t>
-          </w:r>
-          <w:r>
-            <w:rPr>
-              <w:rFonts w:hint="eastAsia" w:ascii="Consolas" w:eastAsia="宋体" w:hAnsiTheme="minorAscii" w:cstheme="minorBidi"/>
-              <w:color w:val="252525"/>
-              <w:kern w:val="2"/>
-              <w:sz w:val="21"/>
-              <w:szCs w:val="24"/>
-              <w:shd w:val="clear"/>
-              <w:lang w:val="en-US" w:eastAsia="zh-CN" w:bidi="ar-SA"/>
-            </w:rPr>
-            <w:t xml:space="preserve"> fputc</w:t>
-          </w:r>
-          <w:r>
-            <w:rPr>
-              <w:rFonts w:hint="eastAsia" w:ascii="Consolas" w:eastAsia="宋体" w:hAnsiTheme="minorAscii" w:cstheme="minorBidi"/>
-              <w:color w:val="252525"/>
-              <w:kern w:val="2"/>
-              <w:sz w:val="21"/>
-              <w:szCs w:val="24"/>
-              <w:shd w:val="clear"/>
-              <w:lang w:val="en-US" w:eastAsia="zh-CN" w:bidi="ar-SA"/>
-            </w:rPr>
-            <w:t>(单个字符, FILE *f) 把字符输出</w:t>
+            <w:t>循环调用 fputc(单个字符, FILE *f) 把字符输出</w:t>
           </w:r>
         </w:p>
         <w:p>
@@ -1716,304 +1973,88 @@
               <w:shd w:val="clear"/>
               <w:lang w:val="en-US" w:eastAsia="zh-CN" w:bidi="ar-SA"/>
             </w:rPr>
-            <w:t>int</w:t>
-          </w:r>
-          <w:r>
-            <w:rPr>
-              <w:rFonts w:hint="eastAsia" w:ascii="Consolas" w:eastAsia="宋体" w:hAnsiTheme="minorAscii" w:cstheme="minorBidi"/>
-              <w:color w:val="252525"/>
-              <w:kern w:val="2"/>
-              <w:sz w:val="21"/>
-              <w:szCs w:val="24"/>
-              <w:shd w:val="clear"/>
-              <w:lang w:val="en-US" w:eastAsia="zh-CN" w:bidi="ar-SA"/>
-            </w:rPr>
-            <w:t xml:space="preserve"> ch：printf</w:t>
-          </w:r>
-          <w:r>
-            <w:rPr>
-              <w:rFonts w:hint="eastAsia" w:ascii="Consolas" w:eastAsia="宋体" w:hAnsiTheme="minorAscii" w:cstheme="minorBidi"/>
-              <w:color w:val="252525"/>
-              <w:kern w:val="2"/>
-              <w:sz w:val="21"/>
-              <w:szCs w:val="24"/>
-              <w:shd w:val="clear"/>
-              <w:lang w:val="en-US" w:eastAsia="zh-CN" w:bidi="ar-SA"/>
-            </w:rPr>
-            <w:t xml:space="preserve"> 传过来的单个字符，例如'A'，ASCII</w:t>
-          </w:r>
-          <w:r>
-            <w:rPr>
-              <w:rFonts w:hint="eastAsia" w:ascii="Consolas" w:eastAsia="宋体" w:hAnsiTheme="minorAscii" w:cstheme="minorBidi"/>
-              <w:color w:val="252525"/>
-              <w:kern w:val="2"/>
-              <w:sz w:val="21"/>
-              <w:szCs w:val="24"/>
-              <w:shd w:val="clear"/>
-              <w:lang w:val="en-US" w:eastAsia="zh-CN" w:bidi="ar-SA"/>
-            </w:rPr>
-            <w:t xml:space="preserve"> 码值存放在</w:t>
-          </w:r>
-          <w:r>
-            <w:rPr>
-              <w:rFonts w:hint="eastAsia" w:ascii="Consolas" w:eastAsia="宋体" w:hAnsiTheme="minorAscii" w:cstheme="minorBidi"/>
-              <w:color w:val="252525"/>
-              <w:kern w:val="2"/>
-              <w:sz w:val="21"/>
-              <w:szCs w:val="24"/>
-              <w:shd w:val="clear"/>
-              <w:lang w:val="en-US" w:eastAsia="zh-CN" w:bidi="ar-SA"/>
-            </w:rPr>
-            <w:t xml:space="preserve"> int</w:t>
-          </w:r>
-          <w:r>
-            <w:rPr>
-              <w:rFonts w:hint="eastAsia" w:ascii="Consolas" w:eastAsia="宋体" w:hAnsiTheme="minorAscii" w:cstheme="minorBidi"/>
-              <w:color w:val="252525"/>
-              <w:kern w:val="2"/>
-              <w:sz w:val="21"/>
-              <w:szCs w:val="24"/>
-              <w:shd w:val="clear"/>
-              <w:lang w:val="en-US" w:eastAsia="zh-CN" w:bidi="ar-SA"/>
-            </w:rPr>
-            <w:t xml:space="preserve"> 变量。</w:t>
-          </w:r>
-        </w:p>
-        <w:p>
-          <w:pPr>
-            <w:shd w:val="clear" w:fill="F5F5F5"/>
-            <w:ind w:left="480" w:leftChars="200"/>
-            <w:rPr>
-              <w:rFonts w:hint="eastAsia" w:ascii="Consolas" w:eastAsia="宋体" w:hAnsiTheme="minorAscii" w:cstheme="minorBidi"/>
-              <w:color w:val="252525"/>
-              <w:kern w:val="2"/>
-              <w:sz w:val="21"/>
-              <w:szCs w:val="24"/>
-              <w:shd w:val="clear"/>
-              <w:lang w:val="en-US" w:eastAsia="zh-CN" w:bidi="ar-SA"/>
-            </w:rPr>
-          </w:pPr>
-          <w:r>
-            <w:rPr>
-              <w:rFonts w:hint="eastAsia" w:ascii="Consolas" w:eastAsia="宋体" w:hAnsiTheme="minorAscii" w:cstheme="minorBidi"/>
-              <w:color w:val="252525"/>
-              <w:kern w:val="2"/>
-              <w:sz w:val="21"/>
-              <w:szCs w:val="24"/>
-              <w:shd w:val="clear"/>
-              <w:lang w:val="en-US" w:eastAsia="zh-CN" w:bidi="ar-SA"/>
-            </w:rPr>
-            <w:t>(uint8_t</w:t>
-          </w:r>
-          <w:r>
-            <w:rPr>
-              <w:rFonts w:hint="eastAsia" w:ascii="Consolas" w:eastAsia="宋体" w:hAnsiTheme="minorAscii" w:cstheme="minorBidi"/>
-              <w:color w:val="252525"/>
-              <w:kern w:val="2"/>
-              <w:sz w:val="21"/>
-              <w:szCs w:val="24"/>
-              <w:shd w:val="clear"/>
-              <w:lang w:val="en-US" w:eastAsia="zh-CN" w:bidi="ar-SA"/>
-            </w:rPr>
-            <w:t xml:space="preserve"> *</w:t>
-          </w:r>
-          <w:r>
-            <w:rPr>
-              <w:rFonts w:hint="eastAsia" w:ascii="Consolas" w:eastAsia="宋体" w:hAnsiTheme="minorAscii" w:cstheme="minorBidi"/>
-              <w:color w:val="252525"/>
-              <w:kern w:val="2"/>
-              <w:sz w:val="21"/>
-              <w:szCs w:val="24"/>
-              <w:shd w:val="clear"/>
-              <w:lang w:val="en-US" w:eastAsia="zh-CN" w:bidi="ar-SA"/>
-            </w:rPr>
-            <w:t>)&amp;ch：取</w:t>
-          </w:r>
-          <w:r>
-            <w:rPr>
-              <w:rFonts w:hint="eastAsia" w:ascii="Consolas" w:eastAsia="宋体" w:hAnsiTheme="minorAscii" w:cstheme="minorBidi"/>
-              <w:color w:val="252525"/>
-              <w:kern w:val="2"/>
-              <w:sz w:val="21"/>
-              <w:szCs w:val="24"/>
-              <w:shd w:val="clear"/>
-              <w:lang w:val="en-US" w:eastAsia="zh-CN" w:bidi="ar-SA"/>
-            </w:rPr>
-            <w:t xml:space="preserve"> ch</w:t>
-          </w:r>
-          <w:r>
-            <w:rPr>
-              <w:rFonts w:hint="eastAsia" w:ascii="Consolas" w:eastAsia="宋体" w:hAnsiTheme="minorAscii" w:cstheme="minorBidi"/>
-              <w:color w:val="252525"/>
-              <w:kern w:val="2"/>
-              <w:sz w:val="21"/>
-              <w:szCs w:val="24"/>
-              <w:shd w:val="clear"/>
-              <w:lang w:val="en-US" w:eastAsia="zh-CN" w:bidi="ar-SA"/>
-            </w:rPr>
-            <w:t xml:space="preserve"> 变量的地址，强制转成uint8_t*，给</w:t>
-          </w:r>
-          <w:r>
-            <w:rPr>
-              <w:rFonts w:hint="eastAsia" w:ascii="Consolas" w:eastAsia="宋体" w:hAnsiTheme="minorAscii" w:cstheme="minorBidi"/>
-              <w:color w:val="252525"/>
-              <w:kern w:val="2"/>
-              <w:sz w:val="21"/>
-              <w:szCs w:val="24"/>
-              <w:shd w:val="clear"/>
-              <w:lang w:val="en-US" w:eastAsia="zh-CN" w:bidi="ar-SA"/>
-            </w:rPr>
-            <w:t xml:space="preserve"> HAL</w:t>
-          </w:r>
-          <w:r>
-            <w:rPr>
-              <w:rFonts w:hint="eastAsia" w:ascii="Consolas" w:eastAsia="宋体" w:hAnsiTheme="minorAscii" w:cstheme="minorBidi"/>
-              <w:color w:val="252525"/>
-              <w:kern w:val="2"/>
-              <w:sz w:val="21"/>
-              <w:szCs w:val="24"/>
-              <w:shd w:val="clear"/>
-              <w:lang w:val="en-US" w:eastAsia="zh-CN" w:bidi="ar-SA"/>
-            </w:rPr>
-            <w:t xml:space="preserve"> 串口函数。</w:t>
-          </w:r>
-        </w:p>
-        <w:p>
-          <w:pPr>
-            <w:shd w:val="clear" w:fill="F5F5F5"/>
-            <w:ind w:left="480" w:leftChars="200"/>
-            <w:rPr>
-              <w:rFonts w:hint="eastAsia" w:ascii="Consolas" w:eastAsia="宋体" w:hAnsiTheme="minorAscii" w:cstheme="minorBidi"/>
-              <w:color w:val="252525"/>
-              <w:kern w:val="2"/>
-              <w:sz w:val="21"/>
-              <w:szCs w:val="24"/>
-              <w:shd w:val="clear"/>
-              <w:lang w:val="en-US" w:eastAsia="zh-CN" w:bidi="ar-SA"/>
-            </w:rPr>
-          </w:pPr>
-          <w:r>
-            <w:rPr>
-              <w:rFonts w:hint="eastAsia" w:ascii="Consolas" w:eastAsia="宋体" w:hAnsiTheme="minorAscii" w:cstheme="minorBidi"/>
-              <w:color w:val="252525"/>
-              <w:kern w:val="2"/>
-              <w:sz w:val="21"/>
-              <w:szCs w:val="24"/>
-              <w:shd w:val="clear"/>
-              <w:lang w:val="en-US" w:eastAsia="zh-CN" w:bidi="ar-SA"/>
-            </w:rPr>
-            <w:t>HAL_UART_Transmit</w:t>
-          </w:r>
-          <w:r>
-            <w:rPr>
-              <w:rFonts w:hint="eastAsia" w:ascii="Consolas" w:eastAsia="宋体" w:hAnsiTheme="minorAscii" w:cstheme="minorBidi"/>
-              <w:color w:val="252525"/>
-              <w:kern w:val="2"/>
-              <w:sz w:val="21"/>
-              <w:szCs w:val="24"/>
-              <w:shd w:val="clear"/>
-              <w:lang w:val="en-US" w:eastAsia="zh-CN" w:bidi="ar-SA"/>
-            </w:rPr>
-            <w:t xml:space="preserve"> 要求传入uint8_t</w:t>
-          </w:r>
-          <w:r>
-            <w:rPr>
-              <w:rFonts w:hint="eastAsia" w:ascii="Consolas" w:eastAsia="宋体" w:hAnsiTheme="minorAscii" w:cstheme="minorBidi"/>
-              <w:color w:val="252525"/>
-              <w:kern w:val="2"/>
-              <w:sz w:val="21"/>
-              <w:szCs w:val="24"/>
-              <w:shd w:val="clear"/>
-              <w:lang w:val="en-US" w:eastAsia="zh-CN" w:bidi="ar-SA"/>
-            </w:rPr>
-            <w:t xml:space="preserve"> *pData字节缓冲区指针，每次只发送1</w:t>
-          </w:r>
-          <w:r>
-            <w:rPr>
-              <w:rFonts w:hint="eastAsia" w:ascii="Consolas" w:eastAsia="宋体" w:hAnsiTheme="minorAscii" w:cstheme="minorBidi"/>
-              <w:color w:val="252525"/>
-              <w:kern w:val="2"/>
-              <w:sz w:val="21"/>
-              <w:szCs w:val="24"/>
-              <w:shd w:val="clear"/>
-              <w:lang w:val="en-US" w:eastAsia="zh-CN" w:bidi="ar-SA"/>
-            </w:rPr>
-            <w:t xml:space="preserve"> 个字节。</w:t>
-          </w:r>
-        </w:p>
-        <w:p>
-          <w:pPr>
-            <w:shd w:val="clear" w:fill="F5F5F5"/>
-            <w:ind w:left="480" w:leftChars="200"/>
-            <w:rPr>
-              <w:rFonts w:hint="eastAsia" w:ascii="Consolas" w:eastAsia="宋体" w:hAnsiTheme="minorAscii" w:cstheme="minorBidi"/>
-              <w:color w:val="252525"/>
-              <w:kern w:val="2"/>
-              <w:sz w:val="21"/>
-              <w:szCs w:val="24"/>
-              <w:shd w:val="clear"/>
-              <w:lang w:val="en-US" w:eastAsia="zh-CN" w:bidi="ar-SA"/>
-            </w:rPr>
-          </w:pPr>
-          <w:r>
-            <w:rPr>
-              <w:rFonts w:hint="eastAsia" w:ascii="Consolas" w:eastAsia="宋体" w:hAnsiTheme="minorAscii" w:cstheme="minorBidi"/>
-              <w:color w:val="252525"/>
-              <w:kern w:val="2"/>
-              <w:sz w:val="21"/>
-              <w:szCs w:val="24"/>
-              <w:shd w:val="clear"/>
-              <w:lang w:val="en-US" w:eastAsia="zh-CN" w:bidi="ar-SA"/>
-            </w:rPr>
-            <w:t>1：Size</w:t>
-          </w:r>
-          <w:r>
-            <w:rPr>
-              <w:rFonts w:hint="eastAsia" w:ascii="Consolas" w:eastAsia="宋体" w:hAnsiTheme="minorAscii" w:cstheme="minorBidi"/>
-              <w:color w:val="252525"/>
-              <w:kern w:val="2"/>
-              <w:sz w:val="21"/>
-              <w:szCs w:val="24"/>
-              <w:shd w:val="clear"/>
-              <w:lang w:val="en-US" w:eastAsia="zh-CN" w:bidi="ar-SA"/>
-            </w:rPr>
-            <w:t xml:space="preserve"> =</w:t>
-          </w:r>
-          <w:r>
-            <w:rPr>
-              <w:rFonts w:hint="eastAsia" w:ascii="Consolas" w:eastAsia="宋体" w:hAnsiTheme="minorAscii" w:cstheme="minorBidi"/>
-              <w:color w:val="252525"/>
-              <w:kern w:val="2"/>
-              <w:sz w:val="21"/>
-              <w:szCs w:val="24"/>
-              <w:shd w:val="clear"/>
-              <w:lang w:val="en-US" w:eastAsia="zh-CN" w:bidi="ar-SA"/>
-            </w:rPr>
-            <w:t xml:space="preserve"> 1，每次发送</w:t>
-          </w:r>
-          <w:r>
-            <w:rPr>
-              <w:rFonts w:hint="eastAsia" w:ascii="Consolas" w:eastAsia="宋体" w:hAnsiTheme="minorAscii" w:cstheme="minorBidi"/>
-              <w:color w:val="252525"/>
-              <w:kern w:val="2"/>
-              <w:sz w:val="21"/>
-              <w:szCs w:val="24"/>
-              <w:shd w:val="clear"/>
-              <w:lang w:val="en-US" w:eastAsia="zh-CN" w:bidi="ar-SA"/>
-            </w:rPr>
-            <w:t xml:space="preserve"> 1</w:t>
-          </w:r>
-          <w:r>
-            <w:rPr>
-              <w:rFonts w:hint="eastAsia" w:ascii="Consolas" w:eastAsia="宋体" w:hAnsiTheme="minorAscii" w:cstheme="minorBidi"/>
-              <w:color w:val="252525"/>
-              <w:kern w:val="2"/>
-              <w:sz w:val="21"/>
-              <w:szCs w:val="24"/>
-              <w:shd w:val="clear"/>
-              <w:lang w:val="en-US" w:eastAsia="zh-CN" w:bidi="ar-SA"/>
-            </w:rPr>
-            <w:t xml:space="preserve"> 个字节。</w:t>
+            <w:t>int ch：printf 传过来的单个字符，例如'A'，ASCII 码值存放在 int 变量。</w:t>
+          </w:r>
+        </w:p>
+        <w:p>
+          <w:pPr>
+            <w:shd w:val="clear" w:fill="F5F5F5"/>
+            <w:ind w:left="480" w:leftChars="200"/>
+            <w:rPr>
+              <w:rFonts w:hint="eastAsia" w:ascii="Consolas" w:eastAsia="宋体" w:hAnsiTheme="minorAscii" w:cstheme="minorBidi"/>
+              <w:color w:val="252525"/>
+              <w:kern w:val="2"/>
+              <w:sz w:val="21"/>
+              <w:szCs w:val="24"/>
+              <w:shd w:val="clear"/>
+              <w:lang w:val="en-US" w:eastAsia="zh-CN" w:bidi="ar-SA"/>
+            </w:rPr>
+          </w:pPr>
+          <w:r>
+            <w:rPr>
+              <w:rFonts w:hint="eastAsia" w:ascii="Consolas" w:eastAsia="宋体" w:hAnsiTheme="minorAscii" w:cstheme="minorBidi"/>
+              <w:color w:val="252525"/>
+              <w:kern w:val="2"/>
+              <w:sz w:val="21"/>
+              <w:szCs w:val="24"/>
+              <w:shd w:val="clear"/>
+              <w:lang w:val="en-US" w:eastAsia="zh-CN" w:bidi="ar-SA"/>
+            </w:rPr>
+            <w:t>(uint8_t *)&amp;ch：取 ch 变量的地址，强制转成uint8_t*，给 HAL 串口函数。</w:t>
+          </w:r>
+        </w:p>
+        <w:p>
+          <w:pPr>
+            <w:shd w:val="clear" w:fill="F5F5F5"/>
+            <w:ind w:left="480" w:leftChars="200"/>
+            <w:rPr>
+              <w:rFonts w:hint="eastAsia" w:ascii="Consolas" w:eastAsia="宋体" w:hAnsiTheme="minorAscii" w:cstheme="minorBidi"/>
+              <w:color w:val="252525"/>
+              <w:kern w:val="2"/>
+              <w:sz w:val="21"/>
+              <w:szCs w:val="24"/>
+              <w:shd w:val="clear"/>
+              <w:lang w:val="en-US" w:eastAsia="zh-CN" w:bidi="ar-SA"/>
+            </w:rPr>
+          </w:pPr>
+          <w:r>
+            <w:rPr>
+              <w:rFonts w:hint="eastAsia" w:ascii="Consolas" w:eastAsia="宋体" w:hAnsiTheme="minorAscii" w:cstheme="minorBidi"/>
+              <w:color w:val="252525"/>
+              <w:kern w:val="2"/>
+              <w:sz w:val="21"/>
+              <w:szCs w:val="24"/>
+              <w:shd w:val="clear"/>
+              <w:lang w:val="en-US" w:eastAsia="zh-CN" w:bidi="ar-SA"/>
+            </w:rPr>
+            <w:t>HAL_UART_Transmit 要求传入uint8_t *pData字节缓冲区指针，每次只发送1 个字节。</w:t>
+          </w:r>
+        </w:p>
+        <w:p>
+          <w:pPr>
+            <w:shd w:val="clear" w:fill="F5F5F5"/>
+            <w:ind w:left="480" w:leftChars="200"/>
+            <w:rPr>
+              <w:rFonts w:hint="eastAsia" w:ascii="Consolas" w:eastAsia="宋体" w:hAnsiTheme="minorAscii" w:cstheme="minorBidi"/>
+              <w:color w:val="252525"/>
+              <w:kern w:val="2"/>
+              <w:sz w:val="21"/>
+              <w:szCs w:val="24"/>
+              <w:shd w:val="clear"/>
+              <w:lang w:val="en-US" w:eastAsia="zh-CN" w:bidi="ar-SA"/>
+            </w:rPr>
+          </w:pPr>
+          <w:r>
+            <w:rPr>
+              <w:rFonts w:hint="eastAsia" w:ascii="Consolas" w:eastAsia="宋体" w:hAnsiTheme="minorAscii" w:cstheme="minorBidi"/>
+              <w:color w:val="252525"/>
+              <w:kern w:val="2"/>
+              <w:sz w:val="21"/>
+              <w:szCs w:val="24"/>
+              <w:shd w:val="clear"/>
+              <w:lang w:val="en-US" w:eastAsia="zh-CN" w:bidi="ar-SA"/>
+            </w:rPr>
+            <w:t>1：Size = 1，每次发送 1 个字节。</w:t>
           </w:r>
         </w:p>
         <w:p>
@@ -2037,43 +2078,7 @@
               <w:shd w:val="clear"/>
               <w:lang w:val="en-US" w:eastAsia="zh-CN" w:bidi="ar-SA"/>
             </w:rPr>
-            <w:t>HAL_MAX_DELAY：阻塞无限等待串口发送完成。return</w:t>
-          </w:r>
-          <w:r>
-            <w:rPr>
-              <w:rFonts w:hint="eastAsia" w:ascii="Consolas" w:eastAsia="宋体" w:hAnsiTheme="minorAscii" w:cstheme="minorBidi"/>
-              <w:color w:val="252525"/>
-              <w:kern w:val="2"/>
-              <w:sz w:val="21"/>
-              <w:szCs w:val="24"/>
-              <w:shd w:val="clear"/>
-              <w:lang w:val="en-US" w:eastAsia="zh-CN" w:bidi="ar-SA"/>
-            </w:rPr>
-            <w:t xml:space="preserve"> ch</w:t>
-          </w:r>
-          <w:r>
-            <w:rPr>
-              <w:rFonts w:hint="eastAsia" w:ascii="Consolas" w:eastAsia="宋体" w:hAnsiTheme="minorAscii" w:cstheme="minorBidi"/>
-              <w:color w:val="252525"/>
-              <w:kern w:val="2"/>
-              <w:sz w:val="21"/>
-              <w:szCs w:val="24"/>
-              <w:shd w:val="clear"/>
-              <w:lang w:val="en-US" w:eastAsia="zh-CN" w:bidi="ar-SA"/>
-            </w:rPr>
-            <w:t>;：fputc</w:t>
-          </w:r>
-          <w:r>
-            <w:rPr>
-              <w:rFonts w:hint="eastAsia" w:ascii="Consolas" w:eastAsia="宋体" w:hAnsiTheme="minorAscii" w:cstheme="minorBidi"/>
-              <w:color w:val="252525"/>
-              <w:kern w:val="2"/>
-              <w:sz w:val="21"/>
-              <w:szCs w:val="24"/>
-              <w:shd w:val="clear"/>
-              <w:lang w:val="en-US" w:eastAsia="zh-CN" w:bidi="ar-SA"/>
-            </w:rPr>
-            <w:t xml:space="preserve"> 的要求，返回这个字符，代表输出成功。</w:t>
+            <w:t>HAL_MAX_DELAY：阻塞无限等待串口发送完成。return ch;：fputc 的要求，返回这个字符，代表输出成功。</w:t>
           </w:r>
         </w:p>
       </w:sdtContent>
@@ -4085,8 +4090,6 @@
             </w:rPr>
             <w:t>/* USER CODE END 2 */</w:t>
           </w:r>
-          <w:bookmarkStart w:id="0" w:name="_GoBack"/>
-          <w:bookmarkEnd w:id="0"/>
         </w:p>
       </w:sdtContent>
     </w:sdt>
@@ -4458,48 +4461,6 @@
   <w:docParts>
     <w:docPart>
       <w:docPartPr>
-        <w:name w:val="{afdc4649-1f91-497d-820f-c049562cbc20}"/>
-        <w:style w:val=""/>
-        <w:category>
-          <w:name w:val="常规"/>
-          <w:gallery w:val="placeholder"/>
-        </w:category>
-        <w:types>
-          <w:type w:val="bbPlcHdr"/>
-        </w:types>
-        <w:behaviors>
-          <w:behavior w:val="content"/>
-        </w:behaviors>
-        <w:description w:val=""/>
-        <w:guid w:val="{afdc4649-1f91-497d-820f-c049562cbc20}"/>
-      </w:docPartPr>
-      <w:docPartBody>
-        <w:p/>
-      </w:docPartBody>
-    </w:docPart>
-    <w:docPart>
-      <w:docPartPr>
-        <w:name w:val="{dc17a641-5f22-4a5e-b07b-b4ae355146a4}"/>
-        <w:style w:val=""/>
-        <w:category>
-          <w:name w:val="常规"/>
-          <w:gallery w:val="placeholder"/>
-        </w:category>
-        <w:types>
-          <w:type w:val="bbPlcHdr"/>
-        </w:types>
-        <w:behaviors>
-          <w:behavior w:val="content"/>
-        </w:behaviors>
-        <w:description w:val=""/>
-        <w:guid w:val="{dc17a641-5f22-4a5e-b07b-b4ae355146a4}"/>
-      </w:docPartPr>
-      <w:docPartBody>
-        <w:p/>
-      </w:docPartBody>
-    </w:docPart>
-    <w:docPart>
-      <w:docPartPr>
         <w:name w:val="{b72d86cc-767d-4a3b-88cd-fe76dd58ce04}"/>
         <w:style w:val=""/>
         <w:category>
@@ -4577,6 +4538,111 @@
         </w:behaviors>
         <w:description w:val=""/>
         <w:guid w:val="{2b3fee11-366b-4bd6-acc8-573b33bb65f9}"/>
+      </w:docPartPr>
+      <w:docPartBody>
+        <w:p/>
+      </w:docPartBody>
+    </w:docPart>
+    <w:docPart>
+      <w:docPartPr>
+        <w:name w:val="{e7d2a870-5b08-477d-a561-9c7a2eb5ece8}"/>
+        <w:style w:val=""/>
+        <w:category>
+          <w:name w:val="常规"/>
+          <w:gallery w:val="placeholder"/>
+        </w:category>
+        <w:types>
+          <w:type w:val="bbPlcHdr"/>
+        </w:types>
+        <w:behaviors>
+          <w:behavior w:val="content"/>
+        </w:behaviors>
+        <w:description w:val=""/>
+        <w:guid w:val="{e7d2a870-5b08-477d-a561-9c7a2eb5ece8}"/>
+      </w:docPartPr>
+      <w:docPartBody>
+        <w:p/>
+      </w:docPartBody>
+    </w:docPart>
+    <w:docPart>
+      <w:docPartPr>
+        <w:name w:val="{63e925f5-1632-4c96-8732-1f5967f56faf}"/>
+        <w:style w:val=""/>
+        <w:category>
+          <w:name w:val="常规"/>
+          <w:gallery w:val="placeholder"/>
+        </w:category>
+        <w:types>
+          <w:type w:val="bbPlcHdr"/>
+        </w:types>
+        <w:behaviors>
+          <w:behavior w:val="content"/>
+        </w:behaviors>
+        <w:description w:val=""/>
+        <w:guid w:val="{63e925f5-1632-4c96-8732-1f5967f56faf}"/>
+      </w:docPartPr>
+      <w:docPartBody>
+        <w:p/>
+      </w:docPartBody>
+    </w:docPart>
+    <w:docPart>
+      <w:docPartPr>
+        <w:name w:val="{499d38ec-73a6-4cbb-8297-49484accb8eb}"/>
+        <w:style w:val=""/>
+        <w:category>
+          <w:name w:val="常规"/>
+          <w:gallery w:val="placeholder"/>
+        </w:category>
+        <w:types>
+          <w:type w:val="bbPlcHdr"/>
+        </w:types>
+        <w:behaviors>
+          <w:behavior w:val="content"/>
+        </w:behaviors>
+        <w:description w:val=""/>
+        <w:guid w:val="{499d38ec-73a6-4cbb-8297-49484accb8eb}"/>
+      </w:docPartPr>
+      <w:docPartBody>
+        <w:p/>
+      </w:docPartBody>
+    </w:docPart>
+    <w:docPart>
+      <w:docPartPr>
+        <w:name w:val="{1b171938-2355-481f-a016-360bc1cb100a}"/>
+        <w:style w:val=""/>
+        <w:category>
+          <w:name w:val="常规"/>
+          <w:gallery w:val="placeholder"/>
+        </w:category>
+        <w:types>
+          <w:type w:val="bbPlcHdr"/>
+        </w:types>
+        <w:behaviors>
+          <w:behavior w:val="content"/>
+        </w:behaviors>
+        <w:description w:val=""/>
+        <w:guid w:val="{1b171938-2355-481f-a016-360bc1cb100a}"/>
+      </w:docPartPr>
+      <w:docPartBody>
+        <w:p/>
+      </w:docPartBody>
+    </w:docPart>
+    <w:docPart>
+      <w:docPartPr>
+        <w:name w:val="{158c76f9-acbb-4111-967a-ee0febe84c6d}"/>
+        <w:style w:val=""/>
+        <w:category>
+          <w:name w:val="常规"/>
+          <w:gallery w:val="placeholder"/>
+        </w:category>
+        <w:types>
+          <w:type w:val="bbPlcHdr"/>
+        </w:types>
+        <w:behaviors>
+          <w:behavior w:val="content"/>
+        </w:behaviors>
+        <w:description w:val=""/>
+        <w:guid w:val="{158c76f9-acbb-4111-967a-ee0febe84c6d}"/>
       </w:docPartPr>
       <w:docPartBody>
         <w:p/>
@@ -4938,8 +5004,11 @@
 
 <file path=customXml/item1.xml><?xml version="1.0" encoding="utf-8"?>
 <wpscustomsdt:customSdtData xmlns="http://www.wps.cn/officeDocument/2025/customizeSdt" xmlns:wpscustomsdt="http://www.wps.cn/officeDocument/2025/customizeSdt">
-  <wpscustomsdt:sdtItem id="147464650" type="1" data="{&quot;codeLang&quot;:&quot;C&quot;,&quot;isDarkTheme&quot;:0}"/>
-  <wpscustomsdt:sdtItem id="147463612" type="1" data="{&quot;codeLang&quot;:&quot;C&quot;,&quot;isDarkTheme&quot;:0}"/>
+  <wpscustomsdt:sdtItem id="147460517" type="1" data="{&quot;codeLang&quot;:&quot;C&quot;,&quot;isDarkTheme&quot;:0}"/>
+  <wpscustomsdt:sdtItem id="147463685" type="1" data="{&quot;codeLang&quot;:&quot;C&quot;,&quot;isDarkTheme&quot;:0}"/>
+  <wpscustomsdt:sdtItem id="147460478" type="1" data="{&quot;codeLang&quot;:&quot;C&quot;,&quot;isDarkTheme&quot;:0}"/>
+  <wpscustomsdt:sdtItem id="147460465" type="1" data="{&quot;codeLang&quot;:&quot;C&quot;,&quot;isDarkTheme&quot;:0}"/>
+  <wpscustomsdt:sdtItem id="147460449" type="1" data="{&quot;codeLang&quot;:&quot;C&quot;,&quot;isDarkTheme&quot;:0}"/>
   <wpscustomsdt:sdtItem id="147478915" type="1" data="{&quot;codeLang&quot;:&quot;Plain Text&quot;,&quot;isDarkTheme&quot;:0}"/>
   <wpscustomsdt:sdtItem id="147471538" type="1" data="{&quot;codeLang&quot;:&quot;C&quot;,&quot;isDarkTheme&quot;:0}"/>
   <wpscustomsdt:sdtItem id="147471450" type="1" data="{&quot;codeLang&quot;:&quot;C++&quot;,&quot;isDarkTheme&quot;:0}"/>

</xml_diff>